<commit_message>
Rebuild the report docx at four pages
Co-Authored-By: Claude Opus 5.5 <noreply@anthropic.com>
</commit_message>
<xml_diff>
--- a/docs/report/report-draft.docx
+++ b/docs/report/report-draft.docx
@@ -350,6 +350,7 @@
     <w:p>
       <w:pPr>
         <w:pStyle w:val="a6"/>
+        <w:keepNext/>
         <w:numPr>
           <w:ilvl w:val="0"/>
           <w:numId w:val="1"/>
@@ -385,6 +386,7 @@
     <w:p>
       <w:pPr>
         <w:pStyle w:val="a6"/>
+        <w:keepNext/>
         <w:numPr>
           <w:ilvl w:val="0"/>
           <w:numId w:val="1"/>
@@ -414,7 +416,7 @@
           <w:sz w:val="20"/>
           <w:szCs w:val="20"/>
         </w:rPr>
-        <w:t xml:space="preserve">병종별 역할은 1절의 세 원칙에서 정했다. 깃발병은 점령의 유일한 수단이지만 비싸고(5) 싸우지 못하므로 </w:t>
+        <w:t xml:space="preserve">병종별 역할은 1절의 원칙에서 정했다. 깃발병은 점령의 유일한 수단이지만 비싸고 싸우지 못하므로 </w:t>
       </w:r>
       <w:r>
         <w:rPr>
@@ -424,7 +426,7 @@
           <w:sz w:val="20"/>
           <w:szCs w:val="20"/>
         </w:rPr>
-        <w:t xml:space="preserve">수를 묶고 살리는 데</w:t>
+        <w:t xml:space="preserve">수를 묶고 살린다</w:t>
       </w:r>
       <w:r>
         <w:rPr>
@@ -432,7 +434,7 @@
           <w:sz w:val="20"/>
           <w:szCs w:val="20"/>
         </w:rPr>
-        <w:t xml:space="preserve"> 집중한다. 전투병은 상쇄되어 수가 곧 힘이므로 </w:t>
+        <w:t xml:space="preserve">. 전투병은 상쇄되어 수가 곧 힘이므로 </w:t>
       </w:r>
       <w:r>
         <w:rPr>
@@ -450,7 +452,7 @@
           <w:sz w:val="20"/>
           <w:szCs w:val="20"/>
         </w:rPr>
-        <w:t xml:space="preserve">, 과제마다 이기는 데 필요한 인원만 보낸다. 정찰병이 주는 정보(건물 점수)는 승패에 거의 영향이 없어 만들지 않는다.</w:t>
+        <w:t xml:space="preserve"> 과제마다 필요한 인원만 보낸다.</w:t>
       </w:r>
     </w:p>
     <w:tbl>
@@ -517,7 +519,7 @@
                 <w:sz w:val="20"/>
                 <w:szCs w:val="20"/>
               </w:rPr>
-              <w:t xml:space="preserve"> 점령 전담. 깃발병 한 명이 건물 하나를 맡도록 효용 (추정 점수 + 기능 가치) ÷ (거리 + 남은 단계 + 2)를 최대화하는 배정(헝가리안). 적 깃발병이 2걸음 안에 온 우리 공학관·학생회관 위에 서서 </w:t>
+              <w:t xml:space="preserve"> 점령 전담. 효용 (추정 점수 + 기능 가치) ÷ (거리 + 남은 단계 + 2)가 최대가 되게 한 명씩 건물에 배정(헝가리안). 적 깃발병이 2걸음 안에 온 우리 공학관·학생회관 위에 서서 </w:t>
             </w:r>
             <w:r>
               <w:rPr>
@@ -535,7 +537,7 @@
                 <w:sz w:val="20"/>
                 <w:szCs w:val="20"/>
               </w:rPr>
-              <w:t xml:space="preserve">으로 상대 점령을 막는 수비도 맡는다</w:t>
+              <w:t xml:space="preserve">으로 상대 점령을 막기도 한다</w:t>
             </w:r>
           </w:p>
           <w:p>
@@ -559,7 +561,7 @@
                 <w:sz w:val="20"/>
                 <w:szCs w:val="20"/>
               </w:rPr>
-              <w:t xml:space="preserve"> 매 턴 생산의 1순위는 깃발병 최소 인원 2명(건물 수가 밀리면 3명). 그다음 전투병을 채우고, 남으면 "점령 과제 수 + 1"명까지. </w:t>
+              <w:t xml:space="preserve"> 생산 1순위는 최소 인원 2명(건물 수가 밀리면 3명), 전투병을 채운 뒤 "점령 과제 수 + 1"명까지, </w:t>
             </w:r>
             <w:r>
               <w:rPr>
@@ -571,14 +573,6 @@
               </w:rPr>
               <w:t xml:space="preserve">총원 상한 6명</w:t>
             </w:r>
-            <w:r>
-              <w:rPr>
-                <w:rFonts w:ascii="맑은 고딕" w:eastAsia="맑은 고딕" w:hAnsi="맑은 고딕" w:hint="eastAsia"/>
-                <w:sz w:val="20"/>
-                <w:szCs w:val="20"/>
-              </w:rPr>
-              <w:t xml:space="preserve"> — 목표 수만큼 만들던 때 20턴까지 깃발병에 35~75를 써서 전투병이 상대보다 10~15명 적었다</w:t>
-            </w:r>
           </w:p>
           <w:p>
             <w:pPr>
@@ -601,7 +595,7 @@
                 <w:sz w:val="20"/>
                 <w:szCs w:val="20"/>
               </w:rPr>
-              <w:t xml:space="preserve"> 첫 턴부터. 이동은 「목표 쪽 안전한 칸 → 대기 → 안전한 이웃으로 피하기 → 포위되면 열세가 가장 작은 칸 → 그래도 목표 쪽」 순서로 판단</w:t>
+              <w:t xml:space="preserve"> 첫 턴부터. 이동은 안전한 칸 → 대기 → 피하기 → 포위되면 열세가 가장 작은 칸 순서</w:t>
             </w:r>
           </w:p>
         </w:tc>
@@ -655,7 +649,7 @@
                 <w:sz w:val="20"/>
                 <w:szCs w:val="20"/>
               </w:rPr>
-              <w:t xml:space="preserve"> 과제 단위로 움직인다: 적 깃발병 처치, 이동 중 깃발병 호위(들어갈 칸을 먼저 차지), 위험한 목표로 가는 깃발병의 별동대, 우리 건물 지키기·선제 수비·몰아내기·탈환, 상대 건물 러시·급습·초소·양동. 과제마다 "그 칸 위협 + 1"처럼 이기는 데 필요한 인원을 정하고 채울 수 있는 과제부터 배정</w:t>
+              <w:t xml:space="preserve"> 과제 단위: 적 깃발병 처치, 깃발병 호위·별동대, 우리 건물 지키기·선제 수비·몰아내기·탈환, 상대 건물 러시·급습·초소·양동. 과제마다 "그 칸 위협 + 1"처럼 이기는 인원을 정하고 채울 수 있는 과제부터 배정</w:t>
             </w:r>
           </w:p>
           <w:p>
@@ -679,25 +673,25 @@
                 <w:sz w:val="20"/>
                 <w:szCs w:val="20"/>
               </w:rPr>
-              <w:t xml:space="preserve"> 목표 인원 = 적 전투병 + 2(최소 3). 깃발병 몫을 뺀 </w:t>
-            </w:r>
-            <w:r>
-              <w:rPr>
-                <w:rFonts w:ascii="맑은 고딕" w:eastAsia="맑은 고딕" w:hAnsi="맑은 고딕" w:hint="eastAsia"/>
-                <w:b/>
-                <w:bCs/>
-                <w:sz w:val="20"/>
-                <w:szCs w:val="20"/>
-              </w:rPr>
-              <w:t xml:space="preserve">남는 자원은 쌓지 않고 모두 전투병</w:t>
-            </w:r>
-            <w:r>
-              <w:rPr>
-                <w:rFonts w:ascii="맑은 고딕" w:eastAsia="맑은 고딕" w:hAnsi="맑은 고딕" w:hint="eastAsia"/>
-                <w:sz w:val="20"/>
-                <w:szCs w:val="20"/>
-              </w:rPr>
-              <w:t xml:space="preserve">. 공학관을 곧 얻으면 생산을 미뤄 값 2로 산다(공학관 적립). 생산 위치는 본진·우리 병원 중 목표에 가장 가까운 곳</w:t>
+              <w:t xml:space="preserve"> 목표 인원 = 적 전투병 + 2(최소 3). </w:t>
+            </w:r>
+            <w:r>
+              <w:rPr>
+                <w:rFonts w:ascii="맑은 고딕" w:eastAsia="맑은 고딕" w:hAnsi="맑은 고딕" w:hint="eastAsia"/>
+                <w:b/>
+                <w:bCs/>
+                <w:sz w:val="20"/>
+                <w:szCs w:val="20"/>
+              </w:rPr>
+              <w:t xml:space="preserve">남는 자원은 모두 전투병</w:t>
+            </w:r>
+            <w:r>
+              <w:rPr>
+                <w:rFonts w:ascii="맑은 고딕" w:eastAsia="맑은 고딕" w:hAnsi="맑은 고딕" w:hint="eastAsia"/>
+                <w:sz w:val="20"/>
+                <w:szCs w:val="20"/>
+              </w:rPr>
+              <w:t xml:space="preserve">. 공학관을 곧 얻으면 생산을 미뤄 값 2로 산다. 생산 위치는 본진·병원 중 목표에 가까운 곳</w:t>
             </w:r>
           </w:p>
           <w:p>
@@ -721,7 +715,7 @@
                 <w:sz w:val="20"/>
                 <w:szCs w:val="20"/>
               </w:rPr>
-              <w:t xml:space="preserve"> 첫 턴부터. 호위 인원은 시기별로 0명(~20턴) → 1명(~40턴) → 4명(~80턴) → 1명. 역 두 곳을 가지면 경로에 순간이동을 넣는다</w:t>
+              <w:t xml:space="preserve"> 첫 턴부터. 호위는 시기별 0 → 1 → 4명(~80턴) → 1명. 역 두 곳이면 순간이동</w:t>
             </w:r>
           </w:p>
         </w:tc>
@@ -823,7 +817,7 @@
                 <w:sz w:val="20"/>
                 <w:szCs w:val="20"/>
               </w:rPr>
-              <w:t xml:space="preserve"> 시뮬레이터에서 모든 건물 점수를 처음부터 알려 준 봇도 같은 봇 상대 49%(200판)여서 점수 정보의 가치가 거의 0이었다. 서버 상위 팀도 정찰병을 쓰지 않았다</w:t>
+              <w:t xml:space="preserve"> 모든 건물 점수를 미리 알려 준 봇도 같은 봇 상대 49%(200판)여서 점수 정보의 가치가 거의 0이었다</w:t>
             </w:r>
           </w:p>
         </w:tc>
@@ -846,12 +840,13 @@
           <w:sz w:val="20"/>
           <w:szCs w:val="20"/>
         </w:rPr>
-        <w:t xml:space="preserve">위 값은 기준값이고, 학습 층이 매 턴 전투병 차·건물 수 차·공학관/학생회관 차·자원·본진 침입 정도·턴을 보고 상수 37개(과제 가치, 깃발병 상한, 별동대 인원 등)에 배수를 곱한다. BT 구조와 과제 종류는 그대로이고 "지금 무엇을 얼마나 중시할지"만 바뀐다.</w:t>
+        <w:t xml:space="preserve">위 값은 기준값이고, 학습 층이 매 턴 상황 특징으로 상수 37개(과제 가치, 깃발병 상한, 별동대 인원 등)에 배수를 곱한다.</w:t>
       </w:r>
     </w:p>
     <w:p>
       <w:pPr>
         <w:pStyle w:val="a6"/>
+        <w:keepNext/>
         <w:numPr>
           <w:ilvl w:val="0"/>
           <w:numId w:val="1"/>
@@ -878,10 +873,20 @@
       <w:r>
         <w:rPr>
           <w:rFonts w:ascii="맑은 고딕" w:eastAsia="맑은 고딕" w:hAnsi="맑은 고딕" w:hint="eastAsia"/>
+          <w:b/>
+          <w:bCs/>
           <w:sz w:val="20"/>
           <w:szCs w:val="20"/>
         </w:rPr>
-        <w:t xml:space="preserve">구역마다 건물이 하는 일이 달라 방침을 나눴다. </w:t>
+        <w:t xml:space="preserve">우리 캠퍼스</w:t>
+      </w:r>
+      <w:r>
+        <w:rPr>
+          <w:rFonts w:ascii="맑은 고딕" w:eastAsia="맑은 고딕" w:hAnsi="맑은 고딕" w:hint="eastAsia"/>
+          <w:sz w:val="20"/>
+          <w:szCs w:val="20"/>
+        </w:rPr>
+        <w:t xml:space="preserve">는 생산을 좌우하는 공학관·학생회관이 있어 지키는 곳, </w:t>
       </w:r>
       <w:r>
         <w:rPr>
@@ -891,7 +896,7 @@
           <w:sz w:val="20"/>
           <w:szCs w:val="20"/>
         </w:rPr>
-        <w:t xml:space="preserve">우리 캠퍼스</w:t>
+        <w:t xml:space="preserve">중앙</w:t>
       </w:r>
       <w:r>
         <w:rPr>
@@ -899,25 +904,7 @@
           <w:sz w:val="20"/>
           <w:szCs w:val="20"/>
         </w:rPr>
-        <w:t xml:space="preserve">에는 생산을 좌우하는 공학관·학생회관이 있어 지키는 곳이고, </w:t>
-      </w:r>
-      <w:r>
-        <w:rPr>
-          <w:rFonts w:ascii="맑은 고딕" w:eastAsia="맑은 고딕" w:hAnsi="맑은 고딕" w:hint="eastAsia"/>
-          <w:b/>
-          <w:bCs/>
-          <w:sz w:val="20"/>
-          <w:szCs w:val="20"/>
-        </w:rPr>
-        <w:t xml:space="preserve">중앙</w:t>
-      </w:r>
-      <w:r>
-        <w:rPr>
-          <w:rFonts w:ascii="맑은 고딕" w:eastAsia="맑은 고딕" w:hAnsi="맑은 고딕" w:hint="eastAsia"/>
-          <w:sz w:val="20"/>
-          <w:szCs w:val="20"/>
-        </w:rPr>
-        <w:t xml:space="preserve">은 점수가 높지만(2~4점, 광장 3점) 양쪽 본진에서 거리가 비슷해 다투는 곳이며, </w:t>
+        <w:t xml:space="preserve">은 점수가 높고(2~4점) 양쪽에서 거리가 비슷해 다투는 곳, </w:t>
       </w:r>
       <w:r>
         <w:rPr>
@@ -1012,7 +999,7 @@
                 <w:sz w:val="20"/>
                 <w:szCs w:val="20"/>
               </w:rPr>
-              <w:t xml:space="preserve"> 초반 30턴 중립 가치 × 1.5로 먼저 확보. 공학관(전투병 값 3 → 2) 기능 가치 2.0, 학생회관(수입 +2)은 남은 턴 × 0.02로 초반일수록 높게</w:t>
+              <w:t xml:space="preserve"> 초반 30턴 중립 가치 × 1.5로 먼저 확보. 공학관 기능 가치 2.0, 학생회관은 남은 턴 × 0.02(초반일수록 높게)</w:t>
             </w:r>
           </w:p>
           <w:p>
@@ -1054,7 +1041,7 @@
                 <w:sz w:val="20"/>
                 <w:szCs w:val="20"/>
               </w:rPr>
-              <w:t xml:space="preserve">: 적 깃발병이 3칸 안에 온 건물(위협 대응 국면 가치 × 2). </w:t>
+              <w:t xml:space="preserve">: 적 깃발병이 3칸 안. </w:t>
             </w:r>
             <w:r>
               <w:rPr>
@@ -1072,7 +1059,7 @@
                 <w:sz w:val="20"/>
                 <w:szCs w:val="20"/>
               </w:rPr>
-              <w:t xml:space="preserve">: 적 깃발병이 6걸음 안인데 우리 전투병이 2턴 이상 먼저 닿지 못하는 건물에 미리. </w:t>
+              <w:t xml:space="preserve">: 적 깃발병이 6걸음 안이고 우리 전투병이 2턴 이상 먼저 닿지 못함. </w:t>
             </w:r>
             <w:r>
               <w:rPr>
@@ -1090,7 +1077,7 @@
                 <w:sz w:val="20"/>
                 <w:szCs w:val="20"/>
               </w:rPr>
-              <w:t xml:space="preserve">: 적 전투병이 2칸 안에 온 학생회관·공학관·병원(경제 건물은 2걸음 안 적까지 셈). </w:t>
+              <w:t xml:space="preserve">: 적 전투병이 2칸 안(학생회관·공학관·병원). </w:t>
             </w:r>
             <w:r>
               <w:rPr>
@@ -1108,7 +1095,7 @@
                 <w:sz w:val="20"/>
                 <w:szCs w:val="20"/>
               </w:rPr>
-              <w:t xml:space="preserve">: 위 경합. </w:t>
+              <w:t xml:space="preserve">(경합). </w:t>
             </w:r>
             <w:r>
               <w:rPr>
@@ -1126,49 +1113,7 @@
                 <w:sz w:val="20"/>
                 <w:szCs w:val="20"/>
               </w:rPr>
-              <w:t xml:space="preserve">: 20턴 안에 잃은 공학관. </w:t>
-            </w:r>
-            <w:r>
-              <w:rPr>
-                <w:rFonts w:ascii="맑은 고딕" w:eastAsia="맑은 고딕" w:hAnsi="맑은 고딕" w:hint="eastAsia"/>
-                <w:b/>
-                <w:bCs/>
-                <w:sz w:val="20"/>
-                <w:szCs w:val="20"/>
-              </w:rPr>
-              <w:t xml:space="preserve">기동대</w:t>
-            </w:r>
-            <w:r>
-              <w:rPr>
-                <w:rFonts w:ascii="맑은 고딕" w:eastAsia="맑은 고딕" w:hAnsi="맑은 고딕" w:hint="eastAsia"/>
-                <w:sz w:val="20"/>
-                <w:szCs w:val="20"/>
-              </w:rPr>
-              <w:t xml:space="preserve">: 깊은 곳 건물을 80턴에 2번 잃으면 전담 3명</w:t>
-            </w:r>
-          </w:p>
-          <w:p>
-            <w:pPr>
-              <w:spacing w:after="20" w:line="240" w:lineRule="auto"/>
-              <w:ind w:left="0"/>
-            </w:pPr>
-            <w:r>
-              <w:rPr>
-                <w:rFonts w:ascii="맑은 고딕" w:eastAsia="맑은 고딕" w:hAnsi="맑은 고딕" w:hint="eastAsia"/>
-                <w:b/>
-                <w:bCs/>
-                <w:sz w:val="20"/>
-                <w:szCs w:val="20"/>
-              </w:rPr>
-              <w:t xml:space="preserve">공격</w:t>
-            </w:r>
-            <w:r>
-              <w:rPr>
-                <w:rFonts w:ascii="맑은 고딕" w:eastAsia="맑은 고딕" w:hAnsi="맑은 고딕" w:hint="eastAsia"/>
-                <w:sz w:val="20"/>
-                <w:szCs w:val="20"/>
-              </w:rPr>
-              <w:t xml:space="preserve"> –</w:t>
+              <w:t xml:space="preserve">: 20턴 안에 잃은 공학관</w:t>
             </w:r>
           </w:p>
         </w:tc>
@@ -1203,7 +1148,7 @@
                 <w:sz w:val="20"/>
                 <w:szCs w:val="20"/>
               </w:rPr>
-              <w:t xml:space="preserve"> (광장·서울역 2·방송국 2·보급소 2)</w:t>
+              <w:t xml:space="preserve"> (광장·서울역·방송국·보급소)</w:t>
             </w:r>
           </w:p>
         </w:tc>
@@ -1232,7 +1177,7 @@
                 <w:sz w:val="20"/>
                 <w:szCs w:val="20"/>
               </w:rPr>
-              <w:t xml:space="preserve"> 점수를 모르면 3.0점(캠퍼스 1.5)으로 추정. 보급소는 최초 점령 +15 자원이라 가치 3.5. 광장은 비용 4라 40턴 전엔 목표에서 뺌. 역은 순간이동 짝이 생길 때 가치(짝 역 주변의 공학관·보급소를 더함)</w:t>
+              <w:t xml:space="preserve"> 모르는 점수는 3.0점으로 추정(캠퍼스 1.5). 보급소는 +15 자원이라 가치 3.5, 광장은 비용 4라 40턴 전엔 제외, 역은 순간이동 짝이 생길 때 가치</w:t>
             </w:r>
           </w:p>
           <w:p>
@@ -1256,7 +1201,7 @@
                 <w:sz w:val="20"/>
                 <w:szCs w:val="20"/>
               </w:rPr>
-              <w:t xml:space="preserve"> 위험 할인: 적 전투병이 닿는 건물은 깃발병 목표 가치 × 0.5. 깃발병 앞길은 호위·별동대가 먼저 차지</w:t>
+              <w:t xml:space="preserve"> 적 전투병이 닿는 건물은 목표 가치 × 0.5. 깃발병 앞길은 호위·별동대가 먼저 차지</w:t>
             </w:r>
           </w:p>
           <w:p>
@@ -1280,7 +1225,7 @@
                 <w:sz w:val="20"/>
                 <w:szCs w:val="20"/>
               </w:rPr>
-              <w:t xml:space="preserve"> 진 경기의 차이가 중앙에서 났다(4절 ⑦). 중앙 건물 급습·몰아내기·역 차단을 따로 시험했으나 효과가 없어, 중앙은 효용 점수와 깃발병 생존(포위 탈출)으로 다툰다</w:t>
+              <w:t xml:space="preserve"> 진 경기의 차이가 중앙에서 났지만(4절 ⑦) 중앙 급습·역 차단은 효과가 없어, 효용 점수와 깃발병 생존으로 다툰다</w:t>
             </w:r>
           </w:p>
         </w:tc>
@@ -1334,7 +1279,7 @@
                 <w:sz w:val="20"/>
                 <w:szCs w:val="20"/>
               </w:rPr>
-              <w:t xml:space="preserve"> 상대 건물은 중립화 → 점령 2단계라 점령 비용을 효용에 반영</w:t>
+              <w:t xml:space="preserve"> 중립화 → 점령 2단계라 점령 비용을 효용에 반영</w:t>
             </w:r>
           </w:p>
           <w:p>
@@ -1376,7 +1321,7 @@
                 <w:sz w:val="20"/>
                 <w:szCs w:val="20"/>
               </w:rPr>
-              <w:t xml:space="preserve">: 상대 건물마다 전투병 1명을 앞에 둠</w:t>
+              <w:t xml:space="preserve">: 상대 건물마다 1명</w:t>
             </w:r>
           </w:p>
           <w:p>
@@ -1418,7 +1363,7 @@
                 <w:sz w:val="20"/>
                 <w:szCs w:val="20"/>
               </w:rPr>
-              <w:t xml:space="preserve">: 60턴까지 상대 공학관에 "위협 + 2"명, 점령 가치 × 3. </w:t>
+              <w:t xml:space="preserve">: 60턴까지 상대 공학관에 "위협 + 2"명. </w:t>
             </w:r>
             <w:r>
               <w:rPr>
@@ -1436,7 +1381,7 @@
                 <w:sz w:val="20"/>
                 <w:szCs w:val="20"/>
               </w:rPr>
-              <w:t xml:space="preserve">: 상대 공학관·학생회관에 전투병, 점령 가치 × 2. </w:t>
+              <w:t xml:space="preserve">: 상대 공학관·학생회관(점령 가치 × 2). </w:t>
             </w:r>
             <w:r>
               <w:rPr>
@@ -1454,7 +1399,7 @@
                 <w:sz w:val="20"/>
                 <w:szCs w:val="20"/>
               </w:rPr>
-              <w:t xml:space="preserve">: 24~120턴, 수비가 약하고 우리 주력이 가까운 건물 하나를 쳐서 상대 병력을 분산(신호가 클 때만)</w:t>
+              <w:t xml:space="preserve">: 수비가 약한 건물 하나를 쳐서 병력 분산</w:t>
             </w:r>
           </w:p>
         </w:tc>
@@ -1477,12 +1422,13 @@
           <w:sz w:val="20"/>
           <w:szCs w:val="20"/>
         </w:rPr>
-        <w:t xml:space="preserve">국면 판단(BT 위층): 위협 대응(적 깃발병이 3칸 안에 온 우리 건물의 점수 합 ≥ 2) → 굳히기(110턴 뒤 앞섬) → 공격(전투병 2명 이상 우세) → 확장 순서로 처음 성립하는 국면이 과제 구성·가중치를 정한다. 실제로는 31턴 뒤 턴의 94~100%가 위협 대응이어서, 국면보다 과제별 조건이 판단의 중심이다. 국면 전환을 꺼도 승점 변화가 −0.6 ±4.3%p로 오차 안이었다(4절). 막판 15턴 전용 규칙(끝내지 못할 점령 버리기, 우리 건물 지키기 등)도 시험했으나 목표를 버린 깃발병이 상대 점령을 막던 경합까지 사라져 18~52%로 나빠져, 마지막까지 같은 판단을 유지한다.</w:t>
+        <w:t xml:space="preserve">BT 위층은 위협 대응 → 굳히기 → 공격 → 확장 중 처음 성립하는 국면으로 과제 가중치를 정하지만, 31턴 뒤 94~100%가 위협 대응이고 국면 전환을 꺼도 −0.6 ±4.3%p라 실제 판단은 과제별 조건이 이끈다. 막판 15턴 전용 규칙은 상대 점령을 막던 경합까지 없애 18~52%로 나빠져 두지 않았다.</w:t>
       </w:r>
     </w:p>
     <w:p>
       <w:pPr>
         <w:pStyle w:val="a6"/>
+        <w:keepNext/>
         <w:numPr>
           <w:ilvl w:val="0"/>
           <w:numId w:val="1"/>
@@ -1512,7 +1458,7 @@
           <w:sz w:val="20"/>
           <w:szCs w:val="20"/>
         </w:rPr>
-        <w:t xml:space="preserve">개발은 한 가지 순환을 되풀이했다. 서버 경기 리플레이에서 진 이유를 수치로 찾고(문제 인식), 그 원인을 규칙과 연결해 바꿀 판단을 정한 뒤(변경), 스위치로 구현해 제출본과 직접 대결로 채택 여부를 정했다(검증). 대결은 공식 개발도구 엔진으로 만든 로컬 시뮬레이터에서 진영을 바꿔 가며 두고 승점률과 95% 구간을 적었다. 9/29 로컬 리그 1위 봇이 서버 36위에 그친 뒤로는 흉내 봇 상대 성적 대신 </w:t>
+        <w:t xml:space="preserve">개발은 "리플레이에서 진 이유를 수치로 찾고 → 규칙과 연결해 판단을 바꾸고 → 제출본과 직접 대결로 채택"을 되풀이했다. 대결은 공식 엔진 기반 로컬 시뮬레이터에서 진영을 바꿔 두고 승점률과 95% 구간을 적었다. 9/29 로컬 리그 1위 봇이 서버 36위에 그친 뒤로는 흉내 봇 성적 대신 </w:t>
       </w:r>
       <w:r>
         <w:rPr>
@@ -1522,7 +1468,7 @@
           <w:sz w:val="20"/>
           <w:szCs w:val="20"/>
         </w:rPr>
-        <w:t xml:space="preserve">제출본과의 직접 대결</w:t>
+        <w:t xml:space="preserve">제출본과의 직접 대결을 학습·선택에 쓰지 않은 새 랜덤 시드</w:t>
       </w:r>
       <w:r>
         <w:rPr>
@@ -1530,25 +1476,7 @@
           <w:sz w:val="20"/>
           <w:szCs w:val="20"/>
         </w:rPr>
-        <w:t xml:space="preserve">을, 학습·선택에 쓰지 않은 </w:t>
-      </w:r>
-      <w:r>
-        <w:rPr>
-          <w:rFonts w:ascii="맑은 고딕" w:eastAsia="맑은 고딕" w:hAnsi="맑은 고딕" w:hint="eastAsia"/>
-          <w:b/>
-          <w:bCs/>
-          <w:sz w:val="20"/>
-          <w:szCs w:val="20"/>
-        </w:rPr>
-        <w:t xml:space="preserve">새 랜덤 시드</w:t>
-      </w:r>
-      <w:r>
-        <w:rPr>
-          <w:rFonts w:ascii="맑은 고딕" w:eastAsia="맑은 고딕" w:hAnsi="맑은 고딕" w:hint="eastAsia"/>
-          <w:sz w:val="20"/>
-          <w:szCs w:val="20"/>
-        </w:rPr>
-        <w:t xml:space="preserve">에서 다시 재는 것을 기준으로 삼았다. 맵이 점대칭이라 같은 봇끼리는 모든 경기가 무승부가 되는 성질로 도구를 검증했고, 서버 리플레이는 우리 봇으로 다시 돌려 매 턴 명령이 같음을 확인한 뒤 분석했다.</w:t>
+        <w:t xml:space="preserve">로 재는 것을 기준으로 삼았다.</w:t>
       </w:r>
     </w:p>
     <w:tbl>
@@ -1693,7 +1621,7 @@
                 <w:sz w:val="20"/>
                 <w:szCs w:val="20"/>
               </w:rPr>
-              <w:t xml:space="preserve">목표 분산·건물 가치(M1), 위협 맵·</w:t>
+              <w:t xml:space="preserve">목표 분산(M1), 위협 맵·</w:t>
             </w:r>
             <w:r>
               <w:rPr>
@@ -1711,7 +1639,7 @@
                 <w:sz w:val="20"/>
                 <w:szCs w:val="20"/>
               </w:rPr>
-              <w:t xml:space="preserve">·깃발 뽑기(M2), BT 국면·</w:t>
+              <w:t xml:space="preserve">(M2), BT 국면·</w:t>
             </w:r>
             <w:r>
               <w:rPr>
@@ -1927,7 +1855,7 @@
                 <w:sz w:val="20"/>
                 <w:szCs w:val="20"/>
               </w:rPr>
-              <w:t xml:space="preserve">9/27 패배 경기에서 깃발병 0명인 22턴 중 21턴을 전투병만 생산. 리플레이 18판에서 깃발병 과다 생산으로 20턴 전투병 10~15명 열세. 적이 전투병을 먼저 모은 뒤 깃발병을 들임</w:t>
+              <w:t xml:space="preserve">리플레이 18판: 깃발병 과다 생산으로 20턴 전투병 10~15명 열세. 적이 전투병을 먼저 모은 뒤 깃발병을 들임</w:t>
             </w:r>
           </w:p>
         </w:tc>
@@ -1968,14 +1896,6 @@
             <w:r>
               <w:rPr>
                 <w:rFonts w:ascii="맑은 고딕" w:eastAsia="맑은 고딕" w:hAnsi="맑은 고딕" w:hint="eastAsia"/>
-                <w:sz w:val="20"/>
-                <w:szCs w:val="20"/>
-              </w:rPr>
-              <w:t xml:space="preserve">깃발병 최소 인원 2명 우선, </w:t>
-            </w:r>
-            <w:r>
-              <w:rPr>
-                <w:rFonts w:ascii="맑은 고딕" w:eastAsia="맑은 고딕" w:hAnsi="맑은 고딕" w:hint="eastAsia"/>
                 <w:b/>
                 <w:bCs/>
                 <w:sz w:val="20"/>
@@ -1989,7 +1909,7 @@
                 <w:sz w:val="20"/>
                 <w:szCs w:val="20"/>
               </w:rPr>
-              <w:t xml:space="preserve">, 몰아내기, 헝가리안 깃발병 배정</w:t>
+              <w:t xml:space="preserve">·최소 인원 우선, 몰아내기</w:t>
             </w:r>
           </w:p>
         </w:tc>
@@ -2033,23 +1953,7 @@
                 <w:sz w:val="20"/>
                 <w:szCs w:val="20"/>
               </w:rPr>
-              <w:t xml:space="preserve">직전 </w:t>
-            </w:r>
-            <w:r>
-              <w:rPr>
-                <w:rFonts w:ascii="맑은 고딕" w:eastAsia="맑은 고딕" w:hAnsi="맑은 고딕" w:hint="eastAsia"/>
-                <w:sz w:val="20"/>
-                <w:szCs w:val="20"/>
-              </w:rPr>
-              <w:t xml:space="preserve">main</w:t>
-            </w:r>
-            <w:r>
-              <w:rPr>
-                <w:rFonts w:ascii="맑은 고딕" w:eastAsia="맑은 고딕" w:hAnsi="맑은 고딕" w:hint="eastAsia"/>
-                <w:sz w:val="20"/>
-                <w:szCs w:val="20"/>
-              </w:rPr>
-              <w:t xml:space="preserve"> 상대 시드 묶음 200판씩: 최소 인원 59 · 61%, 상한 네 묶음 평균 64.75%, 몰아내기 서버 맵 28개 71.4%</w:t>
+              <w:t xml:space="preserve">직전 봇 상대 시드 네 묶음 평균 64.75%, 몰아내기 서버 맵 28개 71.4%</w:t>
             </w:r>
           </w:p>
         </w:tc>
@@ -2093,7 +1997,7 @@
                 <w:sz w:val="20"/>
                 <w:szCs w:val="20"/>
               </w:rPr>
-              <w:t xml:space="preserve">10:00 16위(9-4), 22:00 19위(11-5)</w:t>
+              <w:t xml:space="preserve">16위(9-4) → 19위(11-5)</w:t>
             </w:r>
           </w:p>
         </w:tc>
@@ -2159,7 +2063,7 @@
                 <w:sz w:val="20"/>
                 <w:szCs w:val="20"/>
               </w:rPr>
-              <w:t xml:space="preserve">③ 9/29 (문원 테마)</w:t>
+              <w:t xml:space="preserve">⑤ 9/30 20:00 (학습 봇)</w:t>
             </w:r>
           </w:p>
         </w:tc>
@@ -2203,7 +2107,7 @@
                 <w:sz w:val="20"/>
                 <w:szCs w:val="20"/>
               </w:rPr>
-              <w:t xml:space="preserve">서버 강팀에게 공학관을 잃고 생산이 밀림. 우리 깃발병이 강팀보다 2배 넘게 죽음</w:t>
+              <w:t xml:space="preserve">규칙 수정이 더 이득을 못 냄. 공학관 직전 값 3으로 산 전투병 판당 약 30자원, 경제 건물 손실 56번 중 30번이 적 깃발병 단독 진입</w:t>
             </w:r>
           </w:p>
         </w:tc>
@@ -2244,28 +2148,56 @@
             <w:r>
               <w:rPr>
                 <w:rFonts w:ascii="맑은 고딕" w:eastAsia="맑은 고딕" w:hAnsi="맑은 고딕" w:hint="eastAsia"/>
-                <w:sz w:val="20"/>
-                <w:szCs w:val="20"/>
-              </w:rPr>
-              <w:t xml:space="preserve">서버 강팀을 흉내 낸 상대 봇 5종을 만들고 좌표 탐색으로 </w:t>
-            </w:r>
-            <w:r>
-              <w:rPr>
-                <w:rFonts w:ascii="맑은 고딕" w:eastAsia="맑은 고딕" w:hAnsi="맑은 고딕" w:hint="eastAsia"/>
-                <w:b/>
-                <w:bCs/>
-                <w:sz w:val="20"/>
-                <w:szCs w:val="20"/>
-              </w:rPr>
-              <w:t xml:space="preserve">깃발병 호위</w:t>
-            </w:r>
-            <w:r>
-              <w:rPr>
-                <w:rFonts w:ascii="맑은 고딕" w:eastAsia="맑은 고딕" w:hAnsi="맑은 고딕" w:hint="eastAsia"/>
-                <w:sz w:val="20"/>
-                <w:szCs w:val="20"/>
-              </w:rPr>
-              <w:t xml:space="preserve">·경제 건물 2걸음 수비·공학관 러시·초소를 켬</w:t>
+                <w:b/>
+                <w:bCs/>
+                <w:sz w:val="20"/>
+                <w:szCs w:val="20"/>
+              </w:rPr>
+              <w:t xml:space="preserve">공학관 적립</w:t>
+            </w:r>
+            <w:r>
+              <w:rPr>
+                <w:rFonts w:ascii="맑은 고딕" w:eastAsia="맑은 고딕" w:hAnsi="맑은 고딕" w:hint="eastAsia"/>
+                <w:sz w:val="20"/>
+                <w:szCs w:val="20"/>
+              </w:rPr>
+              <w:t xml:space="preserve">, </w:t>
+            </w:r>
+            <w:r>
+              <w:rPr>
+                <w:rFonts w:ascii="맑은 고딕" w:eastAsia="맑은 고딕" w:hAnsi="맑은 고딕" w:hint="eastAsia"/>
+                <w:b/>
+                <w:bCs/>
+                <w:sz w:val="20"/>
+                <w:szCs w:val="20"/>
+              </w:rPr>
+              <w:t xml:space="preserve">수비 깃발</w:t>
+            </w:r>
+            <w:r>
+              <w:rPr>
+                <w:rFonts w:ascii="맑은 고딕" w:eastAsia="맑은 고딕" w:hAnsi="맑은 고딕" w:hint="eastAsia"/>
+                <w:sz w:val="20"/>
+                <w:szCs w:val="20"/>
+              </w:rPr>
+              <w:t xml:space="preserve">(경합), </w:t>
+            </w:r>
+            <w:r>
+              <w:rPr>
+                <w:rFonts w:ascii="맑은 고딕" w:eastAsia="맑은 고딕" w:hAnsi="맑은 고딕" w:hint="eastAsia"/>
+                <w:b/>
+                <w:bCs/>
+                <w:sz w:val="20"/>
+                <w:szCs w:val="20"/>
+              </w:rPr>
+              <w:t xml:space="preserve">ES 학습 층</w:t>
+            </w:r>
+            <w:r>
+              <w:rPr>
+                <w:rFonts w:ascii="맑은 고딕" w:eastAsia="맑은 고딕" w:hAnsi="맑은 고딕" w:hint="eastAsia"/>
+                <w:sz w:val="20"/>
+                <w:szCs w:val="20"/>
+              </w:rPr>
+              <w:t xml:space="preserve">, 성혁 기능 선별</w:t>
             </w:r>
           </w:p>
         </w:tc>
@@ -2309,7 +2241,7 @@
                 <w:sz w:val="20"/>
                 <w:szCs w:val="20"/>
               </w:rPr>
-              <w:t xml:space="preserve">흉내 봇 풀 평균(새 시드 50개) 48.0 → 67.6%, 리그 1위</w:t>
+              <w:t xml:space="preserve">학습 층: 기준 봇 상대 새 시드 461판 66.8%. 성혁 기능 15개를 하나씩 재 오른 조합만</w:t>
             </w:r>
           </w:p>
         </w:tc>
@@ -2353,7 +2285,7 @@
                 <w:sz w:val="20"/>
                 <w:szCs w:val="20"/>
               </w:rPr>
-              <w:t xml:space="preserve">10:00 10위(8-4). 22:00(같은 계열) 36위(6-6) → 평가 기준을 바꿈</w:t>
+              <w:t xml:space="preserve">12위(8-4)</w:t>
             </w:r>
           </w:p>
         </w:tc>
@@ -2419,7 +2351,16 @@
                 <w:sz w:val="20"/>
                 <w:szCs w:val="20"/>
               </w:rPr>
-              <w:t xml:space="preserve">④ 9/30 10:00 (현진 봇)</w:t>
+              <w:t xml:space="preserve">⑦ 최종 </w:t>
+            </w:r>
+            <w:r>
+              <w:rPr>
+                <w:rFonts w:ascii="맑은 고딕" w:eastAsia="맑은 고딕" w:hAnsi="맑은 고딕" w:hint="eastAsia"/>
+                <w:sz w:val="20"/>
+                <w:szCs w:val="20"/>
+                <w:highlight w:val="yellow"/>
+              </w:rPr>
+              <w:t xml:space="preserve">[커밋·결과]</w:t>
             </w:r>
           </w:p>
         </w:tc>
@@ -2463,7 +2404,25 @@
                 <w:sz w:val="20"/>
                 <w:szCs w:val="20"/>
               </w:rPr>
-              <w:t xml:space="preserve">공학관 러시에 우리 공학관을 잃음</w:t>
+              <w:t xml:space="preserve">진 11판: 깃발병 사망 판당 12.9명(이긴 판 5.5), 11.7명이 포위된 채 목표 쪽으로 걸어 들어가 죽음. </w:t>
+            </w:r>
+            <w:r>
+              <w:rPr>
+                <w:rFonts w:ascii="맑은 고딕" w:eastAsia="맑은 고딕" w:hAnsi="맑은 고딕" w:hint="eastAsia"/>
+                <w:b/>
+                <w:bCs/>
+                <w:sz w:val="20"/>
+                <w:szCs w:val="20"/>
+              </w:rPr>
+              <w:t xml:space="preserve">중앙 보유 점수 6.0 : 11.8</w:t>
+            </w:r>
+            <w:r>
+              <w:rPr>
+                <w:rFonts w:ascii="맑은 고딕" w:eastAsia="맑은 고딕" w:hAnsi="맑은 고딕" w:hint="eastAsia"/>
+                <w:sz w:val="20"/>
+                <w:szCs w:val="20"/>
+              </w:rPr>
+              <w:t xml:space="preserve">에서 짐</w:t>
             </w:r>
           </w:p>
         </w:tc>
@@ -2507,7 +2466,16 @@
                 <w:sz w:val="20"/>
                 <w:szCs w:val="20"/>
               </w:rPr>
-              <w:t xml:space="preserve">별동대(깃발병 1 + 전투병 여러 명으로 위험한 목표 집중 점령), 문원 브랜치의 호위·경제 건물 수비 이식</w:t>
+              <w:t xml:space="preserve">포위 탈출: 열세가 가장 작은 이웃으로 </w:t>
+            </w:r>
+            <w:r>
+              <w:rPr>
+                <w:rFonts w:ascii="맑은 고딕" w:eastAsia="맑은 고딕" w:hAnsi="맑은 고딕" w:hint="eastAsia"/>
+                <w:sz w:val="20"/>
+                <w:szCs w:val="20"/>
+                <w:highlight w:val="yellow"/>
+              </w:rPr>
+              <w:t xml:space="preserve">[+ ES 5차]</w:t>
             </w:r>
           </w:p>
         </w:tc>
@@ -2551,815 +2519,7 @@
                 <w:sz w:val="20"/>
                 <w:szCs w:val="20"/>
               </w:rPr>
-              <w:t xml:space="preserve">문원 테마 봇과 직접 622판 약 58.5%</w:t>
-            </w:r>
-          </w:p>
-        </w:tc>
-      </w:tr>
-      <w:tr>
-        <w:tc>
-          <w:tcPr>
-            <w:tcW w:w="1600" w:type="dxa"/>
-            <w:shd w:val="clear" w:color="auto" w:fill="F2F2F2"/>
-            <w:vAlign w:val="center"/>
-          </w:tcPr>
-          <w:p>
-            <w:pPr>
-              <w:spacing w:after="20" w:line="240" w:lineRule="auto"/>
-              <w:ind w:left="0"/>
-            </w:pPr>
-            <w:r>
-              <w:rPr>
-                <w:rFonts w:ascii="맑은 고딕" w:eastAsia="맑은 고딕" w:hAnsi="맑은 고딕" w:hint="eastAsia"/>
-                <w:b/>
-                <w:bCs/>
-                <w:sz w:val="20"/>
-                <w:szCs w:val="20"/>
-              </w:rPr>
-              <w:t xml:space="preserve">결과</w:t>
-            </w:r>
-          </w:p>
-        </w:tc>
-        <w:tc>
-          <w:tcPr>
-            <w:tcW w:w="7376" w:type="dxa"/>
-          </w:tcPr>
-          <w:p>
-            <w:pPr>
-              <w:spacing w:after="20" w:line="240" w:lineRule="auto"/>
-              <w:ind w:left="0"/>
-            </w:pPr>
-            <w:r>
-              <w:rPr>
-                <w:rFonts w:ascii="맑은 고딕" w:eastAsia="맑은 고딕" w:hAnsi="맑은 고딕" w:hint="eastAsia"/>
-                <w:sz w:val="20"/>
-                <w:szCs w:val="20"/>
-              </w:rPr>
-              <w:t xml:space="preserve">22위(7-5)</w:t>
-            </w:r>
-          </w:p>
-        </w:tc>
-      </w:tr>
-    </w:tbl>
-    <w:p>
-      <w:pPr>
-        <w:spacing w:after="0" w:line="240" w:lineRule="auto"/>
-        <w:ind w:left="440"/>
-      </w:pPr>
-    </w:p>
-    <w:tbl>
-      <w:tblPr>
-        <w:tblStyle w:val="aa"/>
-        <w:tblW w:w="8976" w:type="dxa"/>
-        <w:tblLayout w:type="fixed"/>
-        <w:tblCellMar>
-          <w:left w:w="85" w:type="dxa"/>
-          <w:right w:w="85" w:type="dxa"/>
-        </w:tblCellMar>
-        <w:tblLook w:val="04A0" w:firstRow="1" w:lastRow="0" w:firstColumn="1" w:lastColumn="0" w:noHBand="0" w:noVBand="1"/>
-      </w:tblPr>
-      <w:tblGrid>
-        <w:gridCol w:w="1600"/>
-        <w:gridCol w:w="7376"/>
-      </w:tblGrid>
-      <w:tr>
-        <w:tc>
-          <w:tcPr>
-            <w:tcW w:w="1600" w:type="dxa"/>
-            <w:shd w:val="clear" w:color="auto" w:fill="F2F2F2"/>
-            <w:vAlign w:val="center"/>
-          </w:tcPr>
-          <w:p>
-            <w:pPr>
-              <w:spacing w:after="20" w:line="240" w:lineRule="auto"/>
-              <w:ind w:left="0"/>
-            </w:pPr>
-            <w:r>
-              <w:rPr>
-                <w:rFonts w:ascii="맑은 고딕" w:eastAsia="맑은 고딕" w:hAnsi="맑은 고딕" w:hint="eastAsia"/>
-                <w:b/>
-                <w:bCs/>
-                <w:sz w:val="20"/>
-                <w:szCs w:val="20"/>
-              </w:rPr>
-              <w:t xml:space="preserve">제출 번호</w:t>
-            </w:r>
-          </w:p>
-        </w:tc>
-        <w:tc>
-          <w:tcPr>
-            <w:tcW w:w="7376" w:type="dxa"/>
-          </w:tcPr>
-          <w:p>
-            <w:pPr>
-              <w:spacing w:after="20" w:line="240" w:lineRule="auto"/>
-              <w:ind w:left="0"/>
-            </w:pPr>
-            <w:r>
-              <w:rPr>
-                <w:rFonts w:ascii="맑은 고딕" w:eastAsia="맑은 고딕" w:hAnsi="맑은 고딕" w:hint="eastAsia"/>
-                <w:sz w:val="20"/>
-                <w:szCs w:val="20"/>
-              </w:rPr>
-              <w:t xml:space="preserve">⑤ 9/30 20:00 (학습 봇 + 성혁 기능)</w:t>
-            </w:r>
-          </w:p>
-        </w:tc>
-      </w:tr>
-      <w:tr>
-        <w:tc>
-          <w:tcPr>
-            <w:tcW w:w="1600" w:type="dxa"/>
-            <w:shd w:val="clear" w:color="auto" w:fill="F2F2F2"/>
-            <w:vAlign w:val="center"/>
-          </w:tcPr>
-          <w:p>
-            <w:pPr>
-              <w:spacing w:after="20" w:line="240" w:lineRule="auto"/>
-              <w:ind w:left="0"/>
-            </w:pPr>
-            <w:r>
-              <w:rPr>
-                <w:rFonts w:ascii="맑은 고딕" w:eastAsia="맑은 고딕" w:hAnsi="맑은 고딕" w:hint="eastAsia"/>
-                <w:b/>
-                <w:bCs/>
-                <w:sz w:val="20"/>
-                <w:szCs w:val="20"/>
-              </w:rPr>
-              <w:t xml:space="preserve">문제 인식</w:t>
-            </w:r>
-          </w:p>
-        </w:tc>
-        <w:tc>
-          <w:tcPr>
-            <w:tcW w:w="7376" w:type="dxa"/>
-          </w:tcPr>
-          <w:p>
-            <w:pPr>
-              <w:spacing w:after="20" w:line="240" w:lineRule="auto"/>
-              <w:ind w:left="0"/>
-            </w:pPr>
-            <w:r>
-              <w:rPr>
-                <w:rFonts w:ascii="맑은 고딕" w:eastAsia="맑은 고딕" w:hAnsi="맑은 고딕" w:hint="eastAsia"/>
-                <w:sz w:val="20"/>
-                <w:szCs w:val="20"/>
-              </w:rPr>
-              <w:t xml:space="preserve">규칙 수정이 더는 이득을 못 냄. 공학관 직전에 값 3으로 산 전투병이 판당 약 30자원, 경제 건물 손실 56번 중 30번은 적 깃발병 혼자 진입</w:t>
-            </w:r>
-          </w:p>
-        </w:tc>
-      </w:tr>
-      <w:tr>
-        <w:tc>
-          <w:tcPr>
-            <w:tcW w:w="1600" w:type="dxa"/>
-            <w:shd w:val="clear" w:color="auto" w:fill="F2F2F2"/>
-            <w:vAlign w:val="center"/>
-          </w:tcPr>
-          <w:p>
-            <w:pPr>
-              <w:spacing w:after="20" w:line="240" w:lineRule="auto"/>
-              <w:ind w:left="0"/>
-            </w:pPr>
-            <w:r>
-              <w:rPr>
-                <w:rFonts w:ascii="맑은 고딕" w:eastAsia="맑은 고딕" w:hAnsi="맑은 고딕" w:hint="eastAsia"/>
-                <w:b/>
-                <w:bCs/>
-                <w:sz w:val="20"/>
-                <w:szCs w:val="20"/>
-              </w:rPr>
-              <w:t xml:space="preserve">주요 변경 사항</w:t>
-            </w:r>
-          </w:p>
-        </w:tc>
-        <w:tc>
-          <w:tcPr>
-            <w:tcW w:w="7376" w:type="dxa"/>
-          </w:tcPr>
-          <w:p>
-            <w:pPr>
-              <w:spacing w:after="20" w:line="240" w:lineRule="auto"/>
-              <w:ind w:left="0"/>
-            </w:pPr>
-            <w:r>
-              <w:rPr>
-                <w:rFonts w:ascii="맑은 고딕" w:eastAsia="맑은 고딕" w:hAnsi="맑은 고딕" w:hint="eastAsia"/>
-                <w:b/>
-                <w:bCs/>
-                <w:sz w:val="20"/>
-                <w:szCs w:val="20"/>
-              </w:rPr>
-              <w:t xml:space="preserve">공학관 적립</w:t>
-            </w:r>
-            <w:r>
-              <w:rPr>
-                <w:rFonts w:ascii="맑은 고딕" w:eastAsia="맑은 고딕" w:hAnsi="맑은 고딕" w:hint="eastAsia"/>
-                <w:sz w:val="20"/>
-                <w:szCs w:val="20"/>
-              </w:rPr>
-              <w:t xml:space="preserve">, </w:t>
-            </w:r>
-            <w:r>
-              <w:rPr>
-                <w:rFonts w:ascii="맑은 고딕" w:eastAsia="맑은 고딕" w:hAnsi="맑은 고딕" w:hint="eastAsia"/>
-                <w:b/>
-                <w:bCs/>
-                <w:sz w:val="20"/>
-                <w:szCs w:val="20"/>
-              </w:rPr>
-              <w:t xml:space="preserve">수비 깃발</w:t>
-            </w:r>
-            <w:r>
-              <w:rPr>
-                <w:rFonts w:ascii="맑은 고딕" w:eastAsia="맑은 고딕" w:hAnsi="맑은 고딕" w:hint="eastAsia"/>
-                <w:sz w:val="20"/>
-                <w:szCs w:val="20"/>
-              </w:rPr>
-              <w:t xml:space="preserve">(경합), </w:t>
-            </w:r>
-            <w:r>
-              <w:rPr>
-                <w:rFonts w:ascii="맑은 고딕" w:eastAsia="맑은 고딕" w:hAnsi="맑은 고딕" w:hint="eastAsia"/>
-                <w:b/>
-                <w:bCs/>
-                <w:sz w:val="20"/>
-                <w:szCs w:val="20"/>
-              </w:rPr>
-              <w:t xml:space="preserve">ES 학습 층</w:t>
-            </w:r>
-            <w:r>
-              <w:rPr>
-                <w:rFonts w:ascii="맑은 고딕" w:eastAsia="맑은 고딕" w:hAnsi="맑은 고딕" w:hint="eastAsia"/>
-                <w:sz w:val="20"/>
-                <w:szCs w:val="20"/>
-              </w:rPr>
-              <w:t xml:space="preserve">, 성혁 기능(유동 별동대·기동대·조건부 양동·호위 선행·점령 비용 등) 선별 조합</w:t>
-            </w:r>
-          </w:p>
-        </w:tc>
-      </w:tr>
-      <w:tr>
-        <w:tc>
-          <w:tcPr>
-            <w:tcW w:w="1600" w:type="dxa"/>
-            <w:shd w:val="clear" w:color="auto" w:fill="F2F2F2"/>
-            <w:vAlign w:val="center"/>
-          </w:tcPr>
-          <w:p>
-            <w:pPr>
-              <w:spacing w:after="20" w:line="240" w:lineRule="auto"/>
-              <w:ind w:left="0"/>
-            </w:pPr>
-            <w:r>
-              <w:rPr>
-                <w:rFonts w:ascii="맑은 고딕" w:eastAsia="맑은 고딕" w:hAnsi="맑은 고딕" w:hint="eastAsia"/>
-                <w:b/>
-                <w:bCs/>
-                <w:sz w:val="20"/>
-                <w:szCs w:val="20"/>
-              </w:rPr>
-              <w:t xml:space="preserve">검증 방법</w:t>
-            </w:r>
-          </w:p>
-        </w:tc>
-        <w:tc>
-          <w:tcPr>
-            <w:tcW w:w="7376" w:type="dxa"/>
-          </w:tcPr>
-          <w:p>
-            <w:pPr>
-              <w:spacing w:after="20" w:line="240" w:lineRule="auto"/>
-              <w:ind w:left="0"/>
-            </w:pPr>
-            <w:r>
-              <w:rPr>
-                <w:rFonts w:ascii="맑은 고딕" w:eastAsia="맑은 고딕" w:hAnsi="맑은 고딕" w:hint="eastAsia"/>
-                <w:sz w:val="20"/>
-                <w:szCs w:val="20"/>
-              </w:rPr>
-              <w:t xml:space="preserve">학습 층(240세대): 기준 봇 상대 새 시드 461판 66.8%, 서버 맵 85개 × 상대 25개 9,275판 88.2%(기준 봇 81.0%). 성혁 기능 15개를 하나씩 재고 두 상대 모두 오른 조합만(대 학습 봇 57.5%)</w:t>
-            </w:r>
-          </w:p>
-        </w:tc>
-      </w:tr>
-      <w:tr>
-        <w:tc>
-          <w:tcPr>
-            <w:tcW w:w="1600" w:type="dxa"/>
-            <w:shd w:val="clear" w:color="auto" w:fill="F2F2F2"/>
-            <w:vAlign w:val="center"/>
-          </w:tcPr>
-          <w:p>
-            <w:pPr>
-              <w:spacing w:after="20" w:line="240" w:lineRule="auto"/>
-              <w:ind w:left="0"/>
-            </w:pPr>
-            <w:r>
-              <w:rPr>
-                <w:rFonts w:ascii="맑은 고딕" w:eastAsia="맑은 고딕" w:hAnsi="맑은 고딕" w:hint="eastAsia"/>
-                <w:b/>
-                <w:bCs/>
-                <w:sz w:val="20"/>
-                <w:szCs w:val="20"/>
-              </w:rPr>
-              <w:t xml:space="preserve">결과</w:t>
-            </w:r>
-          </w:p>
-        </w:tc>
-        <w:tc>
-          <w:tcPr>
-            <w:tcW w:w="7376" w:type="dxa"/>
-          </w:tcPr>
-          <w:p>
-            <w:pPr>
-              <w:spacing w:after="20" w:line="240" w:lineRule="auto"/>
-              <w:ind w:left="0"/>
-            </w:pPr>
-            <w:r>
-              <w:rPr>
-                <w:rFonts w:ascii="맑은 고딕" w:eastAsia="맑은 고딕" w:hAnsi="맑은 고딕" w:hint="eastAsia"/>
-                <w:sz w:val="20"/>
-                <w:szCs w:val="20"/>
-              </w:rPr>
-              <w:t xml:space="preserve">12위(8-4)</w:t>
-            </w:r>
-          </w:p>
-        </w:tc>
-      </w:tr>
-    </w:tbl>
-    <w:p>
-      <w:pPr>
-        <w:spacing w:after="0" w:line="240" w:lineRule="auto"/>
-        <w:ind w:left="440"/>
-      </w:pPr>
-    </w:p>
-    <w:tbl>
-      <w:tblPr>
-        <w:tblStyle w:val="aa"/>
-        <w:tblW w:w="8976" w:type="dxa"/>
-        <w:tblLayout w:type="fixed"/>
-        <w:tblCellMar>
-          <w:left w:w="85" w:type="dxa"/>
-          <w:right w:w="85" w:type="dxa"/>
-        </w:tblCellMar>
-        <w:tblLook w:val="04A0" w:firstRow="1" w:lastRow="0" w:firstColumn="1" w:lastColumn="0" w:noHBand="0" w:noVBand="1"/>
-      </w:tblPr>
-      <w:tblGrid>
-        <w:gridCol w:w="1600"/>
-        <w:gridCol w:w="7376"/>
-      </w:tblGrid>
-      <w:tr>
-        <w:tc>
-          <w:tcPr>
-            <w:tcW w:w="1600" w:type="dxa"/>
-            <w:shd w:val="clear" w:color="auto" w:fill="F2F2F2"/>
-            <w:vAlign w:val="center"/>
-          </w:tcPr>
-          <w:p>
-            <w:pPr>
-              <w:spacing w:after="20" w:line="240" w:lineRule="auto"/>
-              <w:ind w:left="0"/>
-            </w:pPr>
-            <w:r>
-              <w:rPr>
-                <w:rFonts w:ascii="맑은 고딕" w:eastAsia="맑은 고딕" w:hAnsi="맑은 고딕" w:hint="eastAsia"/>
-                <w:b/>
-                <w:bCs/>
-                <w:sz w:val="20"/>
-                <w:szCs w:val="20"/>
-              </w:rPr>
-              <w:t xml:space="preserve">제출 번호</w:t>
-            </w:r>
-          </w:p>
-        </w:tc>
-        <w:tc>
-          <w:tcPr>
-            <w:tcW w:w="7376" w:type="dxa"/>
-          </w:tcPr>
-          <w:p>
-            <w:pPr>
-              <w:spacing w:after="20" w:line="240" w:lineRule="auto"/>
-              <w:ind w:left="0"/>
-            </w:pPr>
-            <w:r>
-              <w:rPr>
-                <w:rFonts w:ascii="맑은 고딕" w:eastAsia="맑은 고딕" w:hAnsi="맑은 고딕" w:hint="eastAsia"/>
-                <w:sz w:val="20"/>
-                <w:szCs w:val="20"/>
-              </w:rPr>
-              <w:t xml:space="preserve">⑥ 10/1 08:00 (ES 4차 + 선제 수비)</w:t>
-            </w:r>
-          </w:p>
-        </w:tc>
-      </w:tr>
-      <w:tr>
-        <w:tc>
-          <w:tcPr>
-            <w:tcW w:w="1600" w:type="dxa"/>
-            <w:shd w:val="clear" w:color="auto" w:fill="F2F2F2"/>
-            <w:vAlign w:val="center"/>
-          </w:tcPr>
-          <w:p>
-            <w:pPr>
-              <w:spacing w:after="20" w:line="240" w:lineRule="auto"/>
-              <w:ind w:left="0"/>
-            </w:pPr>
-            <w:r>
-              <w:rPr>
-                <w:rFonts w:ascii="맑은 고딕" w:eastAsia="맑은 고딕" w:hAnsi="맑은 고딕" w:hint="eastAsia"/>
-                <w:b/>
-                <w:bCs/>
-                <w:sz w:val="20"/>
-                <w:szCs w:val="20"/>
-              </w:rPr>
-              <w:t xml:space="preserve">문제 인식</w:t>
-            </w:r>
-          </w:p>
-        </w:tc>
-        <w:tc>
-          <w:tcPr>
-            <w:tcW w:w="7376" w:type="dxa"/>
-          </w:tcPr>
-          <w:p>
-            <w:pPr>
-              <w:spacing w:after="20" w:line="240" w:lineRule="auto"/>
-              <w:ind w:left="0"/>
-            </w:pPr>
-            <w:r>
-              <w:rPr>
-                <w:rFonts w:ascii="맑은 고딕" w:eastAsia="맑은 고딕" w:hAnsi="맑은 고딕" w:hint="eastAsia"/>
-                <w:sz w:val="20"/>
-                <w:szCs w:val="20"/>
-              </w:rPr>
-              <w:t xml:space="preserve">진 4판: 깃발병 1 + 전투병 2의 기습조가 후방 빈 건물을 연달아 가져감</w:t>
-            </w:r>
-          </w:p>
-        </w:tc>
-      </w:tr>
-      <w:tr>
-        <w:tc>
-          <w:tcPr>
-            <w:tcW w:w="1600" w:type="dxa"/>
-            <w:shd w:val="clear" w:color="auto" w:fill="F2F2F2"/>
-            <w:vAlign w:val="center"/>
-          </w:tcPr>
-          <w:p>
-            <w:pPr>
-              <w:spacing w:after="20" w:line="240" w:lineRule="auto"/>
-              <w:ind w:left="0"/>
-            </w:pPr>
-            <w:r>
-              <w:rPr>
-                <w:rFonts w:ascii="맑은 고딕" w:eastAsia="맑은 고딕" w:hAnsi="맑은 고딕" w:hint="eastAsia"/>
-                <w:b/>
-                <w:bCs/>
-                <w:sz w:val="20"/>
-                <w:szCs w:val="20"/>
-              </w:rPr>
-              <w:t xml:space="preserve">주요 변경 사항</w:t>
-            </w:r>
-          </w:p>
-        </w:tc>
-        <w:tc>
-          <w:tcPr>
-            <w:tcW w:w="7376" w:type="dxa"/>
-          </w:tcPr>
-          <w:p>
-            <w:pPr>
-              <w:spacing w:after="20" w:line="240" w:lineRule="auto"/>
-              <w:ind w:left="0"/>
-            </w:pPr>
-            <w:r>
-              <w:rPr>
-                <w:rFonts w:ascii="맑은 고딕" w:eastAsia="맑은 고딕" w:hAnsi="맑은 고딕" w:hint="eastAsia"/>
-                <w:sz w:val="20"/>
-                <w:szCs w:val="20"/>
-              </w:rPr>
-              <w:t xml:space="preserve">선제 수비(6걸음·여유 2), 기동대 수정, ES 3·4차 학습</w:t>
-            </w:r>
-          </w:p>
-        </w:tc>
-      </w:tr>
-      <w:tr>
-        <w:tc>
-          <w:tcPr>
-            <w:tcW w:w="1600" w:type="dxa"/>
-            <w:shd w:val="clear" w:color="auto" w:fill="F2F2F2"/>
-            <w:vAlign w:val="center"/>
-          </w:tcPr>
-          <w:p>
-            <w:pPr>
-              <w:spacing w:after="20" w:line="240" w:lineRule="auto"/>
-              <w:ind w:left="0"/>
-            </w:pPr>
-            <w:r>
-              <w:rPr>
-                <w:rFonts w:ascii="맑은 고딕" w:eastAsia="맑은 고딕" w:hAnsi="맑은 고딕" w:hint="eastAsia"/>
-                <w:b/>
-                <w:bCs/>
-                <w:sz w:val="20"/>
-                <w:szCs w:val="20"/>
-              </w:rPr>
-              <w:t xml:space="preserve">검증 방법</w:t>
-            </w:r>
-          </w:p>
-        </w:tc>
-        <w:tc>
-          <w:tcPr>
-            <w:tcW w:w="7376" w:type="dxa"/>
-          </w:tcPr>
-          <w:p>
-            <w:pPr>
-              <w:spacing w:after="20" w:line="240" w:lineRule="auto"/>
-              <w:ind w:left="0"/>
-            </w:pPr>
-            <w:r>
-              <w:rPr>
-                <w:rFonts w:ascii="맑은 고딕" w:eastAsia="맑은 고딕" w:hAnsi="맑은 고딕" w:hint="eastAsia"/>
-                <w:sz w:val="20"/>
-                <w:szCs w:val="20"/>
-              </w:rPr>
-              <w:t xml:space="preserve">직전 봇 상대 700판 54.4%, 최종 600판 대 원본 53.2%</w:t>
-            </w:r>
-          </w:p>
-        </w:tc>
-      </w:tr>
-      <w:tr>
-        <w:tc>
-          <w:tcPr>
-            <w:tcW w:w="1600" w:type="dxa"/>
-            <w:shd w:val="clear" w:color="auto" w:fill="F2F2F2"/>
-            <w:vAlign w:val="center"/>
-          </w:tcPr>
-          <w:p>
-            <w:pPr>
-              <w:spacing w:after="20" w:line="240" w:lineRule="auto"/>
-              <w:ind w:left="0"/>
-            </w:pPr>
-            <w:r>
-              <w:rPr>
-                <w:rFonts w:ascii="맑은 고딕" w:eastAsia="맑은 고딕" w:hAnsi="맑은 고딕" w:hint="eastAsia"/>
-                <w:b/>
-                <w:bCs/>
-                <w:sz w:val="20"/>
-                <w:szCs w:val="20"/>
-              </w:rPr>
-              <w:t xml:space="preserve">결과</w:t>
-            </w:r>
-          </w:p>
-        </w:tc>
-        <w:tc>
-          <w:tcPr>
-            <w:tcW w:w="7376" w:type="dxa"/>
-          </w:tcPr>
-          <w:p>
-            <w:pPr>
-              <w:spacing w:after="20" w:line="240" w:lineRule="auto"/>
-              <w:ind w:left="0"/>
-            </w:pPr>
-            <w:r>
-              <w:rPr>
-                <w:rFonts w:ascii="맑은 고딕" w:eastAsia="맑은 고딕" w:hAnsi="맑은 고딕" w:hint="eastAsia"/>
-                <w:sz w:val="20"/>
-                <w:szCs w:val="20"/>
-              </w:rPr>
-              <w:t xml:space="preserve">18위(13-11, 24경기). 17:00 회차 21위</w:t>
-            </w:r>
-          </w:p>
-        </w:tc>
-      </w:tr>
-    </w:tbl>
-    <w:p>
-      <w:pPr>
-        <w:spacing w:after="0" w:line="240" w:lineRule="auto"/>
-        <w:ind w:left="440"/>
-      </w:pPr>
-    </w:p>
-    <w:tbl>
-      <w:tblPr>
-        <w:tblStyle w:val="aa"/>
-        <w:tblW w:w="8976" w:type="dxa"/>
-        <w:tblLayout w:type="fixed"/>
-        <w:tblCellMar>
-          <w:left w:w="85" w:type="dxa"/>
-          <w:right w:w="85" w:type="dxa"/>
-        </w:tblCellMar>
-        <w:tblLook w:val="04A0" w:firstRow="1" w:lastRow="0" w:firstColumn="1" w:lastColumn="0" w:noHBand="0" w:noVBand="1"/>
-      </w:tblPr>
-      <w:tblGrid>
-        <w:gridCol w:w="1600"/>
-        <w:gridCol w:w="7376"/>
-      </w:tblGrid>
-      <w:tr>
-        <w:tc>
-          <w:tcPr>
-            <w:tcW w:w="1600" w:type="dxa"/>
-            <w:shd w:val="clear" w:color="auto" w:fill="F2F2F2"/>
-            <w:vAlign w:val="center"/>
-          </w:tcPr>
-          <w:p>
-            <w:pPr>
-              <w:spacing w:after="20" w:line="240" w:lineRule="auto"/>
-              <w:ind w:left="0"/>
-            </w:pPr>
-            <w:r>
-              <w:rPr>
-                <w:rFonts w:ascii="맑은 고딕" w:eastAsia="맑은 고딕" w:hAnsi="맑은 고딕" w:hint="eastAsia"/>
-                <w:b/>
-                <w:bCs/>
-                <w:sz w:val="20"/>
-                <w:szCs w:val="20"/>
-              </w:rPr>
-              <w:t xml:space="preserve">제출 번호</w:t>
-            </w:r>
-          </w:p>
-        </w:tc>
-        <w:tc>
-          <w:tcPr>
-            <w:tcW w:w="7376" w:type="dxa"/>
-          </w:tcPr>
-          <w:p>
-            <w:pPr>
-              <w:spacing w:after="20" w:line="240" w:lineRule="auto"/>
-              <w:ind w:left="0"/>
-            </w:pPr>
-            <w:r>
-              <w:rPr>
-                <w:rFonts w:ascii="맑은 고딕" w:eastAsia="맑은 고딕" w:hAnsi="맑은 고딕" w:hint="eastAsia"/>
-                <w:sz w:val="20"/>
-                <w:szCs w:val="20"/>
-              </w:rPr>
-              <w:t xml:space="preserve">⑦ 최종 </w:t>
-            </w:r>
-            <w:r>
-              <w:rPr>
-                <w:rFonts w:ascii="맑은 고딕" w:eastAsia="맑은 고딕" w:hAnsi="맑은 고딕" w:hint="eastAsia"/>
-                <w:sz w:val="20"/>
-                <w:szCs w:val="20"/>
-                <w:highlight w:val="yellow"/>
-              </w:rPr>
-              <w:t xml:space="preserve">[커밋·결과]</w:t>
-            </w:r>
-          </w:p>
-        </w:tc>
-      </w:tr>
-      <w:tr>
-        <w:tc>
-          <w:tcPr>
-            <w:tcW w:w="1600" w:type="dxa"/>
-            <w:shd w:val="clear" w:color="auto" w:fill="F2F2F2"/>
-            <w:vAlign w:val="center"/>
-          </w:tcPr>
-          <w:p>
-            <w:pPr>
-              <w:spacing w:after="20" w:line="240" w:lineRule="auto"/>
-              <w:ind w:left="0"/>
-            </w:pPr>
-            <w:r>
-              <w:rPr>
-                <w:rFonts w:ascii="맑은 고딕" w:eastAsia="맑은 고딕" w:hAnsi="맑은 고딕" w:hint="eastAsia"/>
-                <w:b/>
-                <w:bCs/>
-                <w:sz w:val="20"/>
-                <w:szCs w:val="20"/>
-              </w:rPr>
-              <w:t xml:space="preserve">문제 인식</w:t>
-            </w:r>
-          </w:p>
-        </w:tc>
-        <w:tc>
-          <w:tcPr>
-            <w:tcW w:w="7376" w:type="dxa"/>
-          </w:tcPr>
-          <w:p>
-            <w:pPr>
-              <w:spacing w:after="20" w:line="240" w:lineRule="auto"/>
-              <w:ind w:left="0"/>
-            </w:pPr>
-            <w:r>
-              <w:rPr>
-                <w:rFonts w:ascii="맑은 고딕" w:eastAsia="맑은 고딕" w:hAnsi="맑은 고딕" w:hint="eastAsia"/>
-                <w:sz w:val="20"/>
-                <w:szCs w:val="20"/>
-              </w:rPr>
-              <w:t xml:space="preserve">진 11판: 깃발병 사망 판당 12.9명(이긴 판 5.5), 그중 11.7명이 포위된 채 목표 쪽으로 걸어 들어가 죽음(그 칸의 65%가 실제로 죽는 칸). 우리 진영은 같고 </w:t>
-            </w:r>
-            <w:r>
-              <w:rPr>
-                <w:rFonts w:ascii="맑은 고딕" w:eastAsia="맑은 고딕" w:hAnsi="맑은 고딕" w:hint="eastAsia"/>
-                <w:b/>
-                <w:bCs/>
-                <w:sz w:val="20"/>
-                <w:szCs w:val="20"/>
-              </w:rPr>
-              <w:t xml:space="preserve">중앙 보유 점수 6.0 : 11.8</w:t>
-            </w:r>
-            <w:r>
-              <w:rPr>
-                <w:rFonts w:ascii="맑은 고딕" w:eastAsia="맑은 고딕" w:hAnsi="맑은 고딕" w:hint="eastAsia"/>
-                <w:sz w:val="20"/>
-                <w:szCs w:val="20"/>
-              </w:rPr>
-              <w:t xml:space="preserve">에서 짐</w:t>
-            </w:r>
-          </w:p>
-        </w:tc>
-      </w:tr>
-      <w:tr>
-        <w:tc>
-          <w:tcPr>
-            <w:tcW w:w="1600" w:type="dxa"/>
-            <w:shd w:val="clear" w:color="auto" w:fill="F2F2F2"/>
-            <w:vAlign w:val="center"/>
-          </w:tcPr>
-          <w:p>
-            <w:pPr>
-              <w:spacing w:after="20" w:line="240" w:lineRule="auto"/>
-              <w:ind w:left="0"/>
-            </w:pPr>
-            <w:r>
-              <w:rPr>
-                <w:rFonts w:ascii="맑은 고딕" w:eastAsia="맑은 고딕" w:hAnsi="맑은 고딕" w:hint="eastAsia"/>
-                <w:b/>
-                <w:bCs/>
-                <w:sz w:val="20"/>
-                <w:szCs w:val="20"/>
-              </w:rPr>
-              <w:t xml:space="preserve">주요 변경 사항</w:t>
-            </w:r>
-          </w:p>
-        </w:tc>
-        <w:tc>
-          <w:tcPr>
-            <w:tcW w:w="7376" w:type="dxa"/>
-          </w:tcPr>
-          <w:p>
-            <w:pPr>
-              <w:spacing w:after="20" w:line="240" w:lineRule="auto"/>
-              <w:ind w:left="0"/>
-            </w:pPr>
-            <w:r>
-              <w:rPr>
-                <w:rFonts w:ascii="맑은 고딕" w:eastAsia="맑은 고딕" w:hAnsi="맑은 고딕" w:hint="eastAsia"/>
-                <w:sz w:val="20"/>
-                <w:szCs w:val="20"/>
-              </w:rPr>
-              <w:t xml:space="preserve">포위 탈출: 열세(위협 − 우리 전투병)가 가장 작은 이웃으로 </w:t>
-            </w:r>
-            <w:r>
-              <w:rPr>
-                <w:rFonts w:ascii="맑은 고딕" w:eastAsia="맑은 고딕" w:hAnsi="맑은 고딕" w:hint="eastAsia"/>
-                <w:sz w:val="20"/>
-                <w:szCs w:val="20"/>
-                <w:highlight w:val="yellow"/>
-              </w:rPr>
-              <w:t xml:space="preserve">[+ ES 5차]</w:t>
-            </w:r>
-          </w:p>
-        </w:tc>
-      </w:tr>
-      <w:tr>
-        <w:tc>
-          <w:tcPr>
-            <w:tcW w:w="1600" w:type="dxa"/>
-            <w:shd w:val="clear" w:color="auto" w:fill="F2F2F2"/>
-            <w:vAlign w:val="center"/>
-          </w:tcPr>
-          <w:p>
-            <w:pPr>
-              <w:spacing w:after="20" w:line="240" w:lineRule="auto"/>
-              <w:ind w:left="0"/>
-            </w:pPr>
-            <w:r>
-              <w:rPr>
-                <w:rFonts w:ascii="맑은 고딕" w:eastAsia="맑은 고딕" w:hAnsi="맑은 고딕" w:hint="eastAsia"/>
-                <w:b/>
-                <w:bCs/>
-                <w:sz w:val="20"/>
-                <w:szCs w:val="20"/>
-              </w:rPr>
-              <w:t xml:space="preserve">검증 방법</w:t>
-            </w:r>
-          </w:p>
-        </w:tc>
-        <w:tc>
-          <w:tcPr>
-            <w:tcW w:w="7376" w:type="dxa"/>
-          </w:tcPr>
-          <w:p>
-            <w:pPr>
-              <w:spacing w:after="20" w:line="240" w:lineRule="auto"/>
-              <w:ind w:left="0"/>
-            </w:pPr>
-            <w:r>
-              <w:rPr>
-                <w:rFonts w:ascii="맑은 고딕" w:eastAsia="맑은 고딕" w:hAnsi="맑은 고딕" w:hint="eastAsia"/>
-                <w:sz w:val="20"/>
-                <w:szCs w:val="20"/>
-              </w:rPr>
-              <w:t xml:space="preserve">직전 제출본 상대 새 시드 600 · 600 · 400판 64.4 / 68.0 / 68.6%, 시험한 상대 7개 모두 상승</w:t>
+              <w:t xml:space="preserve">직전 제출본 상대 새 시드 1,600판 64.4~68.6%, 상대 7개 모두 상승</w:t>
             </w:r>
           </w:p>
         </w:tc>
@@ -3427,7 +2587,25 @@
           <w:sz w:val="20"/>
           <w:szCs w:val="20"/>
         </w:rPr>
-        <w:t xml:space="preserve">표에서 굵게 쓴 것은 아래 「개선별 기여도」에서 핵심·중요 등급인 개선이다.</w:t>
+        <w:t xml:space="preserve">그 사이 제출에서는 ③(9/29, 10위) 흉내 봇 5종과 파라미터 탐색으로 </w:t>
+      </w:r>
+      <w:r>
+        <w:rPr>
+          <w:rFonts w:ascii="맑은 고딕" w:eastAsia="맑은 고딕" w:hAnsi="맑은 고딕" w:hint="eastAsia"/>
+          <w:b/>
+          <w:bCs/>
+          <w:sz w:val="20"/>
+          <w:szCs w:val="20"/>
+        </w:rPr>
+        <w:t xml:space="preserve">깃발병 호위</w:t>
+      </w:r>
+      <w:r>
+        <w:rPr>
+          <w:rFonts w:ascii="맑은 고딕" w:eastAsia="맑은 고딕" w:hAnsi="맑은 고딕" w:hint="eastAsia"/>
+          <w:sz w:val="20"/>
+          <w:szCs w:val="20"/>
+        </w:rPr>
+        <w:t xml:space="preserve">·공학관 러시·초소를 켰고, ④(9/30 10:00, 22위) 현진 봇의 별동대를 시험했으며, ⑥(10/1 08:00, 18위) 소규모 기습조에 대응한 선제 수비를 넣었다(직전 봇 상대 700판 54.4%).</w:t>
       </w:r>
     </w:p>
     <w:p>
@@ -3451,23 +2629,7 @@
           <w:sz w:val="20"/>
           <w:szCs w:val="20"/>
         </w:rPr>
-        <w:t xml:space="preserve"> 위 검증 수치는 개선마다 비교 대상·판 수가 달라 서로 비교할 수 없다. 그래서 제출본 ⑥(</w:t>
-      </w:r>
-      <w:r>
-        <w:rPr>
-          <w:rFonts w:ascii="맑은 고딕" w:eastAsia="맑은 고딕" w:hAnsi="맑은 고딕" w:hint="eastAsia"/>
-          <w:sz w:val="20"/>
-          <w:szCs w:val="20"/>
-        </w:rPr>
-        <w:t xml:space="preserve">ee4ea4b</w:t>
-      </w:r>
-      <w:r>
-        <w:rPr>
-          <w:rFonts w:ascii="맑은 고딕" w:eastAsia="맑은 고딕" w:hAnsi="맑은 고딕" w:hint="eastAsia"/>
-          <w:sz w:val="20"/>
-          <w:szCs w:val="20"/>
-        </w:rPr>
-        <w:t xml:space="preserve">)에서 </w:t>
+        <w:t xml:space="preserve"> 위 수치는 비교 대상이 달라 서로 비교할 수 없어, 제출본 ⑥에서 </w:t>
       </w:r>
       <w:r>
         <w:rPr>
@@ -3485,7 +2647,7 @@
           <w:sz w:val="20"/>
           <w:szCs w:val="20"/>
         </w:rPr>
-        <w:t xml:space="preserve"> 25개를 같은 조건으로 다시 쟀다. 상대는 제출본 복사본과 가장 어려운 로컬 상대(서버 강팀 스타일 흉내 봇) 둘, 학습· 선택에 쓰지 않은 새 시드 50000~50549, 총 22,000판(오류·몰수 0)이다. 값은 같은 (상대, 시드) 짝에서 끈 봇 − 제출본의 승점 차이고 ±는 95% 범위다.</w:t>
+        <w:t xml:space="preserve"> 25개를 같은 조건 (제출본 복사본·가장 어려운 로컬 상대, 새 시드, 22,000판)으로 다시 쟀다. 값은 같은 (상대, 시드) 짝의 승점 차와 95% 범위다.</w:t>
       </w:r>
     </w:p>
     <w:tbl>
@@ -3501,9 +2663,9 @@
       </w:tblPr>
       <w:tblGrid>
         <w:gridCol w:w="800"/>
-        <w:gridCol w:w="2900"/>
-        <w:gridCol w:w="1400"/>
-        <w:gridCol w:w="3876"/>
+        <w:gridCol w:w="3000"/>
+        <w:gridCol w:w="1600"/>
+        <w:gridCol w:w="3576"/>
       </w:tblGrid>
       <w:tr>
         <w:trPr>
@@ -3534,7 +2696,7 @@
         </w:tc>
         <w:tc>
           <w:tcPr>
-            <w:tcW w:w="2900" w:type="dxa"/>
+            <w:tcW w:w="3000" w:type="dxa"/>
             <w:shd w:val="clear" w:color="auto" w:fill="F2F2F2"/>
             <w:vAlign w:val="center"/>
           </w:tcPr>
@@ -3557,7 +2719,7 @@
         </w:tc>
         <w:tc>
           <w:tcPr>
-            <w:tcW w:w="1400" w:type="dxa"/>
+            <w:tcW w:w="1600" w:type="dxa"/>
             <w:shd w:val="clear" w:color="auto" w:fill="F2F2F2"/>
             <w:vAlign w:val="center"/>
           </w:tcPr>
@@ -3580,7 +2742,7 @@
         </w:tc>
         <w:tc>
           <w:tcPr>
-            <w:tcW w:w="3876" w:type="dxa"/>
+            <w:tcW w:w="3576" w:type="dxa"/>
             <w:shd w:val="clear" w:color="auto" w:fill="F2F2F2"/>
             <w:vAlign w:val="center"/>
           </w:tcPr>
@@ -3624,7 +2786,7 @@
         </w:tc>
         <w:tc>
           <w:tcPr>
-            <w:tcW w:w="2900" w:type="dxa"/>
+            <w:tcW w:w="3000" w:type="dxa"/>
           </w:tcPr>
           <w:p>
             <w:pPr>
@@ -3643,7 +2805,7 @@
         </w:tc>
         <w:tc>
           <w:tcPr>
-            <w:tcW w:w="1400" w:type="dxa"/>
+            <w:tcW w:w="1600" w:type="dxa"/>
           </w:tcPr>
           <w:p>
             <w:pPr>
@@ -3662,20 +2824,20 @@
         </w:tc>
         <w:tc>
           <w:tcPr>
-            <w:tcW w:w="3876" w:type="dxa"/>
-          </w:tcPr>
-          <w:p>
-            <w:pPr>
-              <w:spacing w:after="20" w:line="240" w:lineRule="auto"/>
-              <w:ind w:left="0"/>
-            </w:pPr>
-            <w:r>
-              <w:rPr>
-                <w:rFonts w:ascii="맑은 고딕" w:eastAsia="맑은 고딕" w:hAnsi="맑은 고딕" w:hint="eastAsia"/>
-                <w:sz w:val="20"/>
-                <w:szCs w:val="20"/>
-              </w:rPr>
-              <w:t xml:space="preserve">M2 상대 실험에서 M3 개선 효과의 대부분(지키기만 켜도 92%)</w:t>
+            <w:tcW w:w="3576" w:type="dxa"/>
+          </w:tcPr>
+          <w:p>
+            <w:pPr>
+              <w:spacing w:after="20" w:line="240" w:lineRule="auto"/>
+              <w:ind w:left="0"/>
+            </w:pPr>
+            <w:r>
+              <w:rPr>
+                <w:rFonts w:ascii="맑은 고딕" w:eastAsia="맑은 고딕" w:hAnsi="맑은 고딕" w:hint="eastAsia"/>
+                <w:sz w:val="20"/>
+                <w:szCs w:val="20"/>
+              </w:rPr>
+              <w:t xml:space="preserve">M3 개선 효과의 대부분</w:t>
             </w:r>
           </w:p>
         </w:tc>
@@ -3702,7 +2864,7 @@
         </w:tc>
         <w:tc>
           <w:tcPr>
-            <w:tcW w:w="2900" w:type="dxa"/>
+            <w:tcW w:w="3000" w:type="dxa"/>
           </w:tcPr>
           <w:p>
             <w:pPr>
@@ -3721,7 +2883,7 @@
         </w:tc>
         <w:tc>
           <w:tcPr>
-            <w:tcW w:w="1400" w:type="dxa"/>
+            <w:tcW w:w="1600" w:type="dxa"/>
           </w:tcPr>
           <w:p>
             <w:pPr>
@@ -3740,20 +2902,20 @@
         </w:tc>
         <w:tc>
           <w:tcPr>
-            <w:tcW w:w="3876" w:type="dxa"/>
-          </w:tcPr>
-          <w:p>
-            <w:pPr>
-              <w:spacing w:after="20" w:line="240" w:lineRule="auto"/>
-              <w:ind w:left="0"/>
-            </w:pPr>
-            <w:r>
-              <w:rPr>
-                <w:rFonts w:ascii="맑은 고딕" w:eastAsia="맑은 고딕" w:hAnsi="맑은 고딕" w:hint="eastAsia"/>
-                <w:sz w:val="20"/>
-                <w:szCs w:val="20"/>
-              </w:rPr>
-              <w:t xml:space="preserve">규칙 수정이 더 이득을 못 내 상황별 가중치를 학습</w:t>
+            <w:tcW w:w="3576" w:type="dxa"/>
+          </w:tcPr>
+          <w:p>
+            <w:pPr>
+              <w:spacing w:after="20" w:line="240" w:lineRule="auto"/>
+              <w:ind w:left="0"/>
+            </w:pPr>
+            <w:r>
+              <w:rPr>
+                <w:rFonts w:ascii="맑은 고딕" w:eastAsia="맑은 고딕" w:hAnsi="맑은 고딕" w:hint="eastAsia"/>
+                <w:sz w:val="20"/>
+                <w:szCs w:val="20"/>
+              </w:rPr>
+              <w:t xml:space="preserve">규칙 수정의 한계</w:t>
             </w:r>
           </w:p>
         </w:tc>
@@ -3780,7 +2942,7 @@
         </w:tc>
         <w:tc>
           <w:tcPr>
-            <w:tcW w:w="2900" w:type="dxa"/>
+            <w:tcW w:w="3000" w:type="dxa"/>
           </w:tcPr>
           <w:p>
             <w:pPr>
@@ -3799,7 +2961,7 @@
         </w:tc>
         <w:tc>
           <w:tcPr>
-            <w:tcW w:w="1400" w:type="dxa"/>
+            <w:tcW w:w="1600" w:type="dxa"/>
           </w:tcPr>
           <w:p>
             <w:pPr>
@@ -3818,20 +2980,20 @@
         </w:tc>
         <w:tc>
           <w:tcPr>
-            <w:tcW w:w="3876" w:type="dxa"/>
-          </w:tcPr>
-          <w:p>
-            <w:pPr>
-              <w:spacing w:after="20" w:line="240" w:lineRule="auto"/>
-              <w:ind w:left="0"/>
-            </w:pPr>
-            <w:r>
-              <w:rPr>
-                <w:rFonts w:ascii="맑은 고딕" w:eastAsia="맑은 고딕" w:hAnsi="맑은 고딕" w:hint="eastAsia"/>
-                <w:sz w:val="20"/>
-                <w:szCs w:val="20"/>
-              </w:rPr>
-              <w:t xml:space="preserve">리플레이 18판: 깃발병 과다 생산으로 20턴 전투병 10~15명 열세</w:t>
+            <w:tcW w:w="3576" w:type="dxa"/>
+          </w:tcPr>
+          <w:p>
+            <w:pPr>
+              <w:spacing w:after="20" w:line="240" w:lineRule="auto"/>
+              <w:ind w:left="0"/>
+            </w:pPr>
+            <w:r>
+              <w:rPr>
+                <w:rFonts w:ascii="맑은 고딕" w:eastAsia="맑은 고딕" w:hAnsi="맑은 고딕" w:hint="eastAsia"/>
+                <w:sz w:val="20"/>
+                <w:szCs w:val="20"/>
+              </w:rPr>
+              <w:t xml:space="preserve">깃발병 과다 생산</w:t>
             </w:r>
           </w:p>
         </w:tc>
@@ -3858,7 +3020,7 @@
         </w:tc>
         <w:tc>
           <w:tcPr>
-            <w:tcW w:w="2900" w:type="dxa"/>
+            <w:tcW w:w="3000" w:type="dxa"/>
           </w:tcPr>
           <w:p>
             <w:pPr>
@@ -3877,7 +3039,7 @@
         </w:tc>
         <w:tc>
           <w:tcPr>
-            <w:tcW w:w="1400" w:type="dxa"/>
+            <w:tcW w:w="1600" w:type="dxa"/>
           </w:tcPr>
           <w:p>
             <w:pPr>
@@ -3896,20 +3058,20 @@
         </w:tc>
         <w:tc>
           <w:tcPr>
-            <w:tcW w:w="3876" w:type="dxa"/>
-          </w:tcPr>
-          <w:p>
-            <w:pPr>
-              <w:spacing w:after="20" w:line="240" w:lineRule="auto"/>
-              <w:ind w:left="0"/>
-            </w:pPr>
-            <w:r>
-              <w:rPr>
-                <w:rFonts w:ascii="맑은 고딕" w:eastAsia="맑은 고딕" w:hAnsi="맑은 고딕" w:hint="eastAsia"/>
-                <w:sz w:val="20"/>
-                <w:szCs w:val="20"/>
-              </w:rPr>
-              <w:t xml:space="preserve">점령 수단은 깃발병뿐 → 적 깃발병 제거가 곧 점령 저지</w:t>
+            <w:tcW w:w="3576" w:type="dxa"/>
+          </w:tcPr>
+          <w:p>
+            <w:pPr>
+              <w:spacing w:after="20" w:line="240" w:lineRule="auto"/>
+              <w:ind w:left="0"/>
+            </w:pPr>
+            <w:r>
+              <w:rPr>
+                <w:rFonts w:ascii="맑은 고딕" w:eastAsia="맑은 고딕" w:hAnsi="맑은 고딕" w:hint="eastAsia"/>
+                <w:sz w:val="20"/>
+                <w:szCs w:val="20"/>
+              </w:rPr>
+              <w:t xml:space="preserve">점령 수단은 깃발병뿐</w:t>
             </w:r>
           </w:p>
         </w:tc>
@@ -3936,7 +3098,7 @@
         </w:tc>
         <w:tc>
           <w:tcPr>
-            <w:tcW w:w="2900" w:type="dxa"/>
+            <w:tcW w:w="3000" w:type="dxa"/>
           </w:tcPr>
           <w:p>
             <w:pPr>
@@ -3955,7 +3117,7 @@
         </w:tc>
         <w:tc>
           <w:tcPr>
-            <w:tcW w:w="1400" w:type="dxa"/>
+            <w:tcW w:w="1600" w:type="dxa"/>
           </w:tcPr>
           <w:p>
             <w:pPr>
@@ -3974,20 +3136,20 @@
         </w:tc>
         <w:tc>
           <w:tcPr>
-            <w:tcW w:w="3876" w:type="dxa"/>
-          </w:tcPr>
-          <w:p>
-            <w:pPr>
-              <w:spacing w:after="20" w:line="240" w:lineRule="auto"/>
-              <w:ind w:left="0"/>
-            </w:pPr>
-            <w:r>
-              <w:rPr>
-                <w:rFonts w:ascii="맑은 고딕" w:eastAsia="맑은 고딕" w:hAnsi="맑은 고딕" w:hint="eastAsia"/>
-                <w:sz w:val="20"/>
-                <w:szCs w:val="20"/>
-              </w:rPr>
-              <w:t xml:space="preserve">경합 규칙. 우리 경제 건물 손실 56번 중 30번이 적 깃발병 단독 진입</w:t>
+            <w:tcW w:w="3576" w:type="dxa"/>
+          </w:tcPr>
+          <w:p>
+            <w:pPr>
+              <w:spacing w:after="20" w:line="240" w:lineRule="auto"/>
+              <w:ind w:left="0"/>
+            </w:pPr>
+            <w:r>
+              <w:rPr>
+                <w:rFonts w:ascii="맑은 고딕" w:eastAsia="맑은 고딕" w:hAnsi="맑은 고딕" w:hint="eastAsia"/>
+                <w:sz w:val="20"/>
+                <w:szCs w:val="20"/>
+              </w:rPr>
+              <w:t xml:space="preserve">경합 규칙</w:t>
             </w:r>
           </w:p>
         </w:tc>
@@ -4014,7 +3176,7 @@
         </w:tc>
         <w:tc>
           <w:tcPr>
-            <w:tcW w:w="2900" w:type="dxa"/>
+            <w:tcW w:w="3000" w:type="dxa"/>
           </w:tcPr>
           <w:p>
             <w:pPr>
@@ -4033,7 +3195,7 @@
         </w:tc>
         <w:tc>
           <w:tcPr>
-            <w:tcW w:w="1400" w:type="dxa"/>
+            <w:tcW w:w="1600" w:type="dxa"/>
           </w:tcPr>
           <w:p>
             <w:pPr>
@@ -4052,20 +3214,20 @@
         </w:tc>
         <w:tc>
           <w:tcPr>
-            <w:tcW w:w="3876" w:type="dxa"/>
-          </w:tcPr>
-          <w:p>
-            <w:pPr>
-              <w:spacing w:after="20" w:line="240" w:lineRule="auto"/>
-              <w:ind w:left="0"/>
-            </w:pPr>
-            <w:r>
-              <w:rPr>
-                <w:rFonts w:ascii="맑은 고딕" w:eastAsia="맑은 고딕" w:hAnsi="맑은 고딕" w:hint="eastAsia"/>
-                <w:sz w:val="20"/>
-                <w:szCs w:val="20"/>
-              </w:rPr>
-              <w:t xml:space="preserve">전투병 값 규칙. 공학관 직전 값 3으로 산 전투병 판당 약 30자원</w:t>
+            <w:tcW w:w="3576" w:type="dxa"/>
+          </w:tcPr>
+          <w:p>
+            <w:pPr>
+              <w:spacing w:after="20" w:line="240" w:lineRule="auto"/>
+              <w:ind w:left="0"/>
+            </w:pPr>
+            <w:r>
+              <w:rPr>
+                <w:rFonts w:ascii="맑은 고딕" w:eastAsia="맑은 고딕" w:hAnsi="맑은 고딕" w:hint="eastAsia"/>
+                <w:sz w:val="20"/>
+                <w:szCs w:val="20"/>
+              </w:rPr>
+              <w:t xml:space="preserve">전투병 값 규칙</w:t>
             </w:r>
           </w:p>
         </w:tc>
@@ -4092,7 +3254,7 @@
         </w:tc>
         <w:tc>
           <w:tcPr>
-            <w:tcW w:w="2900" w:type="dxa"/>
+            <w:tcW w:w="3000" w:type="dxa"/>
           </w:tcPr>
           <w:p>
             <w:pPr>
@@ -4111,7 +3273,7 @@
         </w:tc>
         <w:tc>
           <w:tcPr>
-            <w:tcW w:w="1400" w:type="dxa"/>
+            <w:tcW w:w="1600" w:type="dxa"/>
           </w:tcPr>
           <w:p>
             <w:pPr>
@@ -4130,20 +3292,20 @@
         </w:tc>
         <w:tc>
           <w:tcPr>
-            <w:tcW w:w="3876" w:type="dxa"/>
-          </w:tcPr>
-          <w:p>
-            <w:pPr>
-              <w:spacing w:after="20" w:line="240" w:lineRule="auto"/>
-              <w:ind w:left="0"/>
-            </w:pPr>
-            <w:r>
-              <w:rPr>
-                <w:rFonts w:ascii="맑은 고딕" w:eastAsia="맑은 고딕" w:hAnsi="맑은 고딕" w:hint="eastAsia"/>
-                <w:sz w:val="20"/>
-                <w:szCs w:val="20"/>
-              </w:rPr>
-              <w:t xml:space="preserve">우리 깃발병 사망이 강팀의 2배 이상</w:t>
+            <w:tcW w:w="3576" w:type="dxa"/>
+          </w:tcPr>
+          <w:p>
+            <w:pPr>
+              <w:spacing w:after="20" w:line="240" w:lineRule="auto"/>
+              <w:ind w:left="0"/>
+            </w:pPr>
+            <w:r>
+              <w:rPr>
+                <w:rFonts w:ascii="맑은 고딕" w:eastAsia="맑은 고딕" w:hAnsi="맑은 고딕" w:hint="eastAsia"/>
+                <w:sz w:val="20"/>
+                <w:szCs w:val="20"/>
+              </w:rPr>
+              <w:t xml:space="preserve">깃발병 사망이 강팀의 2배</w:t>
             </w:r>
           </w:p>
         </w:tc>
@@ -4170,26 +3332,26 @@
         </w:tc>
         <w:tc>
           <w:tcPr>
-            <w:tcW w:w="2900" w:type="dxa"/>
-          </w:tcPr>
-          <w:p>
-            <w:pPr>
-              <w:spacing w:after="20" w:line="240" w:lineRule="auto"/>
-              <w:ind w:left="0"/>
-            </w:pPr>
-            <w:r>
-              <w:rPr>
-                <w:rFonts w:ascii="맑은 고딕" w:eastAsia="맑은 고딕" w:hAnsi="맑은 고딕" w:hint="eastAsia"/>
-                <w:sz w:val="20"/>
-                <w:szCs w:val="20"/>
-              </w:rPr>
-              <w:t xml:space="preserve">초반 중립 우선·러시·별동대·선제 수비·급습·호위 선행 (②~⑥)</w:t>
-            </w:r>
-          </w:p>
-        </w:tc>
-        <w:tc>
-          <w:tcPr>
-            <w:tcW w:w="1400" w:type="dxa"/>
+            <w:tcW w:w="3000" w:type="dxa"/>
+          </w:tcPr>
+          <w:p>
+            <w:pPr>
+              <w:spacing w:after="20" w:line="240" w:lineRule="auto"/>
+              <w:ind w:left="0"/>
+            </w:pPr>
+            <w:r>
+              <w:rPr>
+                <w:rFonts w:ascii="맑은 고딕" w:eastAsia="맑은 고딕" w:hAnsi="맑은 고딕" w:hint="eastAsia"/>
+                <w:sz w:val="20"/>
+                <w:szCs w:val="20"/>
+              </w:rPr>
+              <w:t xml:space="preserve">초반 중립 우선·러시·별동대·선제 수비·급습 등 6개</w:t>
+            </w:r>
+          </w:p>
+        </w:tc>
+        <w:tc>
+          <w:tcPr>
+            <w:tcW w:w="1600" w:type="dxa"/>
           </w:tcPr>
           <w:p>
             <w:pPr>
@@ -4208,7 +3370,7 @@
         </w:tc>
         <w:tc>
           <w:tcPr>
-            <w:tcW w:w="3876" w:type="dxa"/>
+            <w:tcW w:w="3576" w:type="dxa"/>
           </w:tcPr>
           <w:p>
             <w:pPr>
@@ -4240,45 +3402,45 @@
         </w:tc>
         <w:tc>
           <w:tcPr>
-            <w:tcW w:w="2900" w:type="dxa"/>
-          </w:tcPr>
-          <w:p>
-            <w:pPr>
-              <w:spacing w:after="20" w:line="240" w:lineRule="auto"/>
-              <w:ind w:left="0"/>
-            </w:pPr>
-            <w:r>
-              <w:rPr>
-                <w:rFonts w:ascii="맑은 고딕" w:eastAsia="맑은 고딕" w:hAnsi="맑은 고딕" w:hint="eastAsia"/>
-                <w:sz w:val="20"/>
-                <w:szCs w:val="20"/>
-              </w:rPr>
-              <w:t xml:space="preserve">몰아내기·탈환·초소·국면 전환·전선·양동·기동대 등 12개</w:t>
-            </w:r>
-          </w:p>
-        </w:tc>
-        <w:tc>
-          <w:tcPr>
-            <w:tcW w:w="1400" w:type="dxa"/>
-          </w:tcPr>
-          <w:p>
-            <w:pPr>
-              <w:spacing w:after="20" w:line="240" w:lineRule="auto"/>
-              <w:ind w:left="0"/>
-            </w:pPr>
-            <w:r>
-              <w:rPr>
-                <w:rFonts w:ascii="맑은 고딕" w:eastAsia="맑은 고딕" w:hAnsi="맑은 고딕" w:hint="eastAsia"/>
-                <w:sz w:val="20"/>
-                <w:szCs w:val="20"/>
-              </w:rPr>
-              <w:t xml:space="preserve">−2.5 ~ +2.1 (오차 안)</w:t>
-            </w:r>
-          </w:p>
-        </w:tc>
-        <w:tc>
-          <w:tcPr>
-            <w:tcW w:w="3876" w:type="dxa"/>
+            <w:tcW w:w="3000" w:type="dxa"/>
+          </w:tcPr>
+          <w:p>
+            <w:pPr>
+              <w:spacing w:after="20" w:line="240" w:lineRule="auto"/>
+              <w:ind w:left="0"/>
+            </w:pPr>
+            <w:r>
+              <w:rPr>
+                <w:rFonts w:ascii="맑은 고딕" w:eastAsia="맑은 고딕" w:hAnsi="맑은 고딕" w:hint="eastAsia"/>
+                <w:sz w:val="20"/>
+                <w:szCs w:val="20"/>
+              </w:rPr>
+              <w:t xml:space="preserve">몰아내기·탈환·국면 전환·양동 등 12개</w:t>
+            </w:r>
+          </w:p>
+        </w:tc>
+        <w:tc>
+          <w:tcPr>
+            <w:tcW w:w="1600" w:type="dxa"/>
+          </w:tcPr>
+          <w:p>
+            <w:pPr>
+              <w:spacing w:after="20" w:line="240" w:lineRule="auto"/>
+              <w:ind w:left="0"/>
+            </w:pPr>
+            <w:r>
+              <w:rPr>
+                <w:rFonts w:ascii="맑은 고딕" w:eastAsia="맑은 고딕" w:hAnsi="맑은 고딕" w:hint="eastAsia"/>
+                <w:sz w:val="20"/>
+                <w:szCs w:val="20"/>
+              </w:rPr>
+              <w:t xml:space="preserve">오차 안</w:t>
+            </w:r>
+          </w:p>
+        </w:tc>
+        <w:tc>
+          <w:tcPr>
+            <w:tcW w:w="3576" w:type="dxa"/>
           </w:tcPr>
           <w:p>
             <w:pPr>
@@ -4306,7 +3468,68 @@
           <w:sz w:val="20"/>
           <w:szCs w:val="20"/>
         </w:rPr>
-        <w:t xml:space="preserve">최종 제출의 포위 탈출(⑦)은 이 측정 뒤에 넣어 같은 방식으로는 재지 않았다. 더한 효과는 제출본 ⑥ 상대 +14~19%p(64.4~68.6%)다.</w:t>
+        <w:t xml:space="preserve">핵심 넷 중 셋은 첫 이틀에 넣은 뼈대이고, 그 뒤로는 규칙 세부를 이용한 수정과 학습이 중요 등급에 들었다. 몰아내기처럼 넣을 때는 컸지만 지금은 오차 안인 것은 지키기·선제 수비가 역할을 메운 것으로 본다. 상대가 우리 봇 계열뿐이라 순위보다 등급으로 보며, ⑦의 포위 탈출은 이 측정 뒤에 넣어 따로 쟀다(+14~19%p).</w:t>
+      </w:r>
+    </w:p>
+    <w:p>
+      <w:pPr>
+        <w:spacing w:after="40" w:line="240" w:lineRule="auto"/>
+        <w:ind w:left="440"/>
+      </w:pPr>
+      <w:r>
+        <w:rPr>
+          <w:rFonts w:ascii="맑은 고딕" w:eastAsia="맑은 고딕" w:hAnsi="맑은 고딕" w:hint="eastAsia"/>
+          <w:b/>
+          <w:bCs/>
+          <w:sz w:val="20"/>
+          <w:szCs w:val="20"/>
+        </w:rPr>
+        <w:t xml:space="preserve">정리.</w:t>
+      </w:r>
+      <w:r>
+        <w:rPr>
+          <w:rFonts w:ascii="맑은 고딕" w:eastAsia="맑은 고딕" w:hAnsi="맑은 고딕" w:hint="eastAsia"/>
+          <w:sz w:val="20"/>
+          <w:szCs w:val="20"/>
+        </w:rPr>
+        <w:t xml:space="preserve"> 깃발병의 역 순간이동, 막판 특수 규칙, 전선 상시 배치, 한 턴 앞 예측, 요격, 역 차단 등 40여 가지는 같은 방식으로 시험해 뺐다. 1절의 원칙을 규칙 세부로 구현한 수정과 학습은 통했고 병력 배치를 다듬는 수정은 대부분 실패해, 배치는 학습 층에 맡기고 사람은 원칙을 판단 조건으로 옮기는 데 집중한 것이 최종 구조가 되었다.</w:t>
+      </w:r>
+    </w:p>
+    <w:p>
+      <w:pPr>
+        <w:pStyle w:val="a6"/>
+        <w:keepNext/>
+        <w:numPr>
+          <w:ilvl w:val="0"/>
+          <w:numId w:val="1"/>
+        </w:numPr>
+        <w:rPr>
+          <w:b/>
+          <w:bCs/>
+        </w:rPr>
+      </w:pPr>
+      <w:r>
+        <w:rPr>
+          <w:rFonts w:hint="eastAsia"/>
+          <w:b/>
+          <w:bCs/>
+        </w:rPr>
+        <w:t>소감</w:t>
+      </w:r>
+    </w:p>
+    <w:p>
+      <w:pPr>
+        <w:spacing w:after="40" w:line="240" w:lineRule="auto"/>
+        <w:ind w:left="440"/>
+      </w:pPr>
+      <w:r>
+        <w:rPr>
+          <w:rFonts w:ascii="맑은 고딕" w:eastAsia="맑은 고딕" w:hAnsi="맑은 고딕" w:hint="eastAsia"/>
+          <w:sz w:val="20"/>
+          <w:szCs w:val="20"/>
+          <w:highlight w:val="yellow"/>
+        </w:rPr>
+        <w:t xml:space="preserve">[각자 고쳐 쓸 것]</w:t>
       </w:r>
     </w:p>
     <w:p>
@@ -4320,25 +3543,7 @@
           <w:sz w:val="20"/>
           <w:szCs w:val="20"/>
         </w:rPr>
-        <w:t xml:space="preserve">· </w:t>
-      </w:r>
-      <w:r>
-        <w:rPr>
-          <w:rFonts w:ascii="맑은 고딕" w:eastAsia="맑은 고딕" w:hAnsi="맑은 고딕" w:hint="eastAsia"/>
-          <w:b/>
-          <w:bCs/>
-          <w:sz w:val="20"/>
-          <w:szCs w:val="20"/>
-        </w:rPr>
-        <w:t xml:space="preserve">핵심 넷 중 셋(지키기·처치·깃발병 상한)은 첫 이틀에 넣은 뼈대</w:t>
-      </w:r>
-      <w:r>
-        <w:rPr>
-          <w:rFonts w:ascii="맑은 고딕" w:eastAsia="맑은 고딕" w:hAnsi="맑은 고딕" w:hint="eastAsia"/>
-          <w:sz w:val="20"/>
-          <w:szCs w:val="20"/>
-        </w:rPr>
-        <w:t xml:space="preserve">이고, 그 뒤의 개선 중에는 규칙 세부를 이용한 것(경합 → 수비 깃발, 전투병 값 → 공학관 적립)과 학습이 중요 등급에 들었다.</w:t>
+        <w:t xml:space="preserve">· 승패를 가르는 것은 화려한 전술이 아니라 "20~30턴에 공학관을 잃으면 생산 격차가 끝까지 남는다"처럼 규칙에서 바로 나오는 사실이었다. 규칙 원문의 비용·경합을 이용한 수정이 가장 크게 통했다.</w:t>
       </w:r>
     </w:p>
     <w:p>
@@ -4352,7 +3557,7 @@
           <w:sz w:val="20"/>
           <w:szCs w:val="20"/>
         </w:rPr>
-        <w:t xml:space="preserve">· 이 값은 "지금 봇에서 뺐을 때의 손실"이지 넣을 때 얻은 효과가 아니다. 몰아내기는 넣을 때 서버 맵 28개에서 71.4%였지만 지금은 오차 안이다. 지키기·선제 수비·탈환이 같은 역할을 하며 서로 메운 것으로 본다.</w:t>
+        <w:t xml:space="preserve">· 로컬에서 강한 봇이 서버에서도 강하지는 않았다. 실험을 많이 돌리는 것보다 무엇과 비교하는지가 더 중요했다.</w:t>
       </w:r>
     </w:p>
     <w:p>
@@ -4366,137 +3571,7 @@
           <w:sz w:val="20"/>
           <w:szCs w:val="20"/>
         </w:rPr>
-        <w:t xml:space="preserve">· 국면 전환이 오차 안이라는 것은 BT 위층의 국면보다 과제별 조건이 실제 판단을 이끈다는 뜻이다(31턴 뒤 94~100%가 위협 대응 국면).</w:t>
-      </w:r>
-    </w:p>
-    <w:p>
-      <w:pPr>
-        <w:spacing w:after="40" w:line="240" w:lineRule="auto"/>
-        <w:ind w:left="640" w:hanging="200"/>
-      </w:pPr>
-      <w:r>
-        <w:rPr>
-          <w:rFonts w:ascii="맑은 고딕" w:eastAsia="맑은 고딕" w:hAnsi="맑은 고딕" w:hint="eastAsia"/>
-          <w:sz w:val="20"/>
-          <w:szCs w:val="20"/>
-        </w:rPr>
-        <w:t xml:space="preserve">· 한계: 상대가 둘 다 우리 봇 계열이라 우리식 공격을 막는 기능은 크게, 다른 유형의 공격에만 통하는 기능은 작게 나올 수 있고, 학습 층은 학습 풀과 겹치는 상대로 재서 과대평가될 수 있다. 그래서 숫자 순위보다 등급으로 본다.</w:t>
-      </w:r>
-    </w:p>
-    <w:p>
-      <w:pPr>
-        <w:spacing w:after="40" w:line="240" w:lineRule="auto"/>
-        <w:ind w:left="440"/>
-      </w:pPr>
-      <w:r>
-        <w:rPr>
-          <w:rFonts w:ascii="맑은 고딕" w:eastAsia="맑은 고딕" w:hAnsi="맑은 고딕" w:hint="eastAsia"/>
-          <w:b/>
-          <w:bCs/>
-          <w:sz w:val="20"/>
-          <w:szCs w:val="20"/>
-        </w:rPr>
-        <w:t xml:space="preserve">효과가 없어 뺀 것과 정리.</w:t>
-      </w:r>
-      <w:r>
-        <w:rPr>
-          <w:rFonts w:ascii="맑은 고딕" w:eastAsia="맑은 고딕" w:hAnsi="맑은 고딕" w:hint="eastAsia"/>
-          <w:sz w:val="20"/>
-          <w:szCs w:val="20"/>
-        </w:rPr>
-        <w:t xml:space="preserve"> 깃발병의 역 순간이동, 막판 15턴 특수 규칙, 전선 상시 배치, 한 턴 앞 예측, 요격, 역 차단, 중앙 건물 급습 등 40여 가지는 같은 방식으로 시험해 뺐다. 채택한 것과 뺀 것을 나란히 놓으면 경계가 분명하다. 1절의 원칙을 규칙 세부로 직접 구현한 수정(생산 → 깃발병 상한·공학관 적립, 경제 건물 → 수비 깃발, 깃발병 생존 → 호위·포위 탈출)과 학습은 통했고, 병력 배치를 다듬는 수정(전선, 상주, 요격, 과제 수 제한 등)은 대부분 실패했다. 배치는 학습 층이 상황에 맞게 조정하는 몫으로 남기고, 사람은 규칙에서 나온 원칙을 판단 조건으로 옮기는 데 집중한 것이 최종 구조가 되었다.</w:t>
-      </w:r>
-    </w:p>
-    <w:p>
-      <w:pPr>
-        <w:pStyle w:val="a6"/>
-        <w:numPr>
-          <w:ilvl w:val="0"/>
-          <w:numId w:val="1"/>
-        </w:numPr>
-        <w:rPr>
-          <w:b/>
-          <w:bCs/>
-        </w:rPr>
-      </w:pPr>
-      <w:r>
-        <w:rPr>
-          <w:rFonts w:hint="eastAsia"/>
-          <w:b/>
-          <w:bCs/>
-        </w:rPr>
-        <w:t>소감</w:t>
-      </w:r>
-    </w:p>
-    <w:p>
-      <w:pPr>
-        <w:spacing w:after="40" w:line="240" w:lineRule="auto"/>
-        <w:ind w:left="440"/>
-      </w:pPr>
-      <w:r>
-        <w:rPr>
-          <w:rFonts w:ascii="맑은 고딕" w:eastAsia="맑은 고딕" w:hAnsi="맑은 고딕" w:hint="eastAsia"/>
-          <w:sz w:val="20"/>
-          <w:szCs w:val="20"/>
-          <w:highlight w:val="yellow"/>
-        </w:rPr>
-        <w:t xml:space="preserve">[각자 고쳐 쓸 것]</w:t>
-      </w:r>
-    </w:p>
-    <w:p>
-      <w:pPr>
-        <w:spacing w:after="40" w:line="240" w:lineRule="auto"/>
-        <w:ind w:left="640" w:hanging="200"/>
-      </w:pPr>
-      <w:r>
-        <w:rPr>
-          <w:rFonts w:ascii="맑은 고딕" w:eastAsia="맑은 고딕" w:hAnsi="맑은 고딕" w:hint="eastAsia"/>
-          <w:sz w:val="20"/>
-          <w:szCs w:val="20"/>
-        </w:rPr>
-        <w:t xml:space="preserve">· 처음에는 승패를 가르는 것이 화려한 전술이라고 생각했지만, 리플레이를 세어 보니 "20~30턴에 공학관을 잃으면 그 뒤 생산 격차가 끝까지 남는다"처럼 규칙에서 바로 나오는 단순한 사실이 대부분을 설명했다. 규칙 원문을 다시 읽고 비용·순서·경합을 이용한 수정이 가장 크게 통했다.</w:t>
-      </w:r>
-    </w:p>
-    <w:p>
-      <w:pPr>
-        <w:spacing w:after="40" w:line="240" w:lineRule="auto"/>
-        <w:ind w:left="640" w:hanging="200"/>
-      </w:pPr>
-      <w:r>
-        <w:rPr>
-          <w:rFonts w:ascii="맑은 고딕" w:eastAsia="맑은 고딕" w:hAnsi="맑은 고딕" w:hint="eastAsia"/>
-          <w:sz w:val="20"/>
-          <w:szCs w:val="20"/>
-        </w:rPr>
-        <w:t xml:space="preserve">· 로컬에서 강한 봇이 서버에서도 강하다는 보장이 없었다. 흉내 봇에 맞춰 튜닝하면 그 상대에만 강해졌고, 이후로는 제출본과의 직접 대결과 새 랜덤 시드로만 판단했다. 실험을 많이 돌리는 것보다 무엇과 비교하는지가 더 중요했다.</w:t>
-      </w:r>
-    </w:p>
-    <w:p>
-      <w:pPr>
-        <w:spacing w:after="40" w:line="240" w:lineRule="auto"/>
-        <w:ind w:left="640" w:hanging="200"/>
-      </w:pPr>
-      <w:r>
-        <w:rPr>
-          <w:rFonts w:ascii="맑은 고딕" w:eastAsia="맑은 고딕" w:hAnsi="맑은 고딕" w:hint="eastAsia"/>
-          <w:sz w:val="20"/>
-          <w:szCs w:val="20"/>
-        </w:rPr>
-        <w:t xml:space="preserve">· 셋이 각자 테마 브랜치에서 봇을 키우고 좋은 기능을 스위치로 옮겨 하나씩 재는 방식 덕분에, 서로의 아이디어를 숫자로 비교하고 합칠 수 있었다.</w:t>
-      </w:r>
-    </w:p>
-    <w:p>
-      <w:pPr>
-        <w:spacing w:after="40" w:line="240" w:lineRule="auto"/>
-        <w:ind w:left="640" w:hanging="200"/>
-      </w:pPr>
-      <w:r>
-        <w:rPr>
-          <w:rFonts w:ascii="맑은 고딕" w:eastAsia="맑은 고딕" w:hAnsi="맑은 고딕" w:hint="eastAsia"/>
-          <w:sz w:val="20"/>
-          <w:szCs w:val="20"/>
-        </w:rPr>
-        <w:t xml:space="preserve">· 1위 팀은 깃발병을 4명만 두고 전투병을 넓게 깔아 건물마다 국지적으로 우세를 만든 뒤 후반에 깃발병을 대량으로 투입했다. 이를 분석했지만 시험할 시간이 없었던 것이 아쉽다.</w:t>
+        <w:t xml:space="preserve">· 셋이 테마 브랜치에서 봇을 키우고 좋은 기능을 스위치로 옮겨 하나씩 재는 방식 덕분에 서로의 아이디어를 숫자로 비교해 합칠 수 있었다.</w:t>
       </w:r>
     </w:p>
     <w:p>

</xml_diff>

<commit_message>
Update the report draft for the final submission 6ed5706 (flag escape, late plaza, diversion to 150) at four pages
Co-Authored-By: Claude Opus 5.5 <noreply@anthropic.com>
</commit_message>
<xml_diff>
--- a/docs/report/report-draft.docx
+++ b/docs/report/report-draft.docx
@@ -380,7 +380,7 @@
           <w:sz w:val="20"/>
           <w:szCs w:val="20"/>
         </w:rPr>
-        <w:t xml:space="preserve">우리 전략은 "전투병은 같은 칸에서 1:1로 상쇄되므로 끝까지 남는 병력 차는 생산량 차이고, 건물은 깃발병만 점령할 수 있다"는 두 규칙에서 출발한다. 그래서 ① 같은 수입으로 전투병을 더 많이 만들고(깃발병은 최소 2명·최대 6명으로 묶고 남는 자원은 모두 전투병, 공학관을 얻기 직전에는 생산을 미뤄 값 2로 산다), ② 생산을 좌우하는 공학관(전투병 값 3 → 2)과 학생회관(수입 +2)을 지키고 빼앗으며, ③ 우리 깃발병은 살리고 적 깃발병은 잡는 것을 원칙으로 삼았다. 운영은 초반 30턴에 중립 건물을 우선해 빠르게 넓히면서 60턴까지 상대 공학관을 노리고, 중반부터는 적 깃발병이 다가오는 우리 건물을 미리 막으면서(지키기·선제 수비·수비 깃발) 상대 경제 건물을 급습하며, 깃발병은 호위·별동대와 함께 움직이고 포위되면 빠져나오게 한다. 판단은 행동 트리(BT)가 국면을 고르고 효용 점수로 유닛에 과제를 나누는 규칙 기반이며, 그 위에 진화 전략(ES)으로 학습한 가중치 층이 전투병·건물·경제 건물 격차 등 상황 특징 8개를 보고 상수 37개의 비중을 매 턴 조정한다. 각 규칙은 서버 리플레이에서 찾은 문제와 새 랜덤 시드 직접 대결로 채택했고, 하나씩 빼 보는 실험에서 지키기·처치·깃발병 상한·학습 층이 각각 17~20%p를 차지하는 뼈대로 확인됐다.</w:t>
+        <w:t xml:space="preserve">우리 전략은 "전투병은 같은 칸에서 1:1로 상쇄되므로 끝까지 남는 병력 차는 생산량 차이고, 건물은 깃발병만 점령할 수 있다"는 두 규칙에서 출발한다. 그래서 ① 같은 수입으로 전투병을 더 많이 만들고(깃발병은 최소 2명·최대 6명으로 묶고 남는 자원은 모두 전투병, 공학관을 얻기 직전에는 생산을 미뤄 값 2로 산다), ② 생산을 좌우하는 공학관(전투병 값 3 → 2)과 학생회관(수입 +2)을 지키고 빼앗으며, ③ 우리 깃발병은 살리고 적 깃발병은 잡는 것을 원칙으로 삼았다. 운영은 초반 30턴에 중립 건물을 우선해 빠르게 넓히면서 60턴까지 상대 공학관을 노리고, 중반부터는 적 깃발병이 다가오는 우리 건물을 미리 막으면서(지키기·선제 수비·수비 깃발) 상대 경제 건물을 급습하며, 깃발병은 호위·별동대와 함께 움직이고 포위되면 적이 가장 덜 많은 칸으로 빠져나오며, 막판에는 광장 가치를 올리고 양동을 150턴까지 이어 160턴 점수를 다툰다. 판단은 행동 트리(BT)가 국면을 고르고 효용 점수로 유닛에 과제를 나누는 규칙 기반이며, 그 위에 진화 전략(ES)으로 학습한 가중치 층이 전투병·건물·경제 건물 격차 등 상황 특징 8개를 보고 상수 37개의 비중을 매 턴 조정한다. 각 규칙은 서버 리플레이에서 찾은 문제와 새 랜덤 시드 직접 대결로 채택했고, 하나씩 빼 보는 실험에서 지키기·처치·깃발병 상한·학습 층이 각각 17~20%p를 차지하는 뼈대로 확인됐다.</w:t>
       </w:r>
     </w:p>
     <w:p>
@@ -1177,7 +1177,25 @@
                 <w:sz w:val="20"/>
                 <w:szCs w:val="20"/>
               </w:rPr>
-              <w:t xml:space="preserve"> 모르는 점수는 3.0점으로 추정(캠퍼스 1.5). 보급소는 +15 자원이라 가치 3.5, 광장은 비용 4라 40턴 전엔 제외, 역은 순간이동 짝이 생길 때 가치</w:t>
+              <w:t xml:space="preserve"> 모르는 점수는 3.0점으로 추정(캠퍼스 1.5). 보급소는 +15 자원이라 가치 3.5, 광장은 비용 4라 40턴 전엔 제외하고 </w:t>
+            </w:r>
+            <w:r>
+              <w:rPr>
+                <w:rFonts w:ascii="맑은 고딕" w:eastAsia="맑은 고딕" w:hAnsi="맑은 고딕" w:hint="eastAsia"/>
+                <w:b/>
+                <w:bCs/>
+                <w:sz w:val="20"/>
+                <w:szCs w:val="20"/>
+              </w:rPr>
+              <w:t xml:space="preserve">130턴부터 가치 +8</w:t>
+            </w:r>
+            <w:r>
+              <w:rPr>
+                <w:rFonts w:ascii="맑은 고딕" w:eastAsia="맑은 고딕" w:hAnsi="맑은 고딕" w:hint="eastAsia"/>
+                <w:sz w:val="20"/>
+                <w:szCs w:val="20"/>
+              </w:rPr>
+              <w:t xml:space="preserve">, 역은 순간이동 짝이 생길 때 가치</w:t>
             </w:r>
           </w:p>
           <w:p>
@@ -1399,7 +1417,7 @@
                 <w:sz w:val="20"/>
                 <w:szCs w:val="20"/>
               </w:rPr>
-              <w:t xml:space="preserve">: 수비가 약한 건물 하나를 쳐서 병력 분산</w:t>
+              <w:t xml:space="preserve">(24~150턴): 수비가 약한 건물 하나를 쳐서 병력 분산</w:t>
             </w:r>
           </w:p>
         </w:tc>
@@ -1422,7 +1440,7 @@
           <w:sz w:val="20"/>
           <w:szCs w:val="20"/>
         </w:rPr>
-        <w:t xml:space="preserve">BT 위층은 위협 대응 → 굳히기 → 공격 → 확장 중 처음 성립하는 국면으로 과제 가중치를 정하지만, 31턴 뒤 94~100%가 위협 대응이고 국면 전환을 꺼도 −0.6 ±4.3%p라 실제 판단은 과제별 조건이 이끈다. 막판 15턴 전용 규칙은 상대 점령을 막던 경합까지 없애 18~52%로 나빠져 두지 않았다.</w:t>
+        <w:t xml:space="preserve">BT 위층은 위협 대응 → 굳히기 → 공격 → 확장 중 처음 성립하는 국면으로 과제 가중치를 정하지만, 31턴 뒤 94~100%가 위협 대응이고 국면 전환을 꺼도 −0.6 ±4.3%p라 실제 판단은 과제별 조건이 이끈다. 막판 15턴 전용 규칙은 상대 점령을 막던 경합까지 없애 18~52%로 나빠져 두지 않았고, 막판에는 광장 가치와 양동 기간만 늘렸다.</w:t>
       </w:r>
     </w:p>
     <w:p>
@@ -2351,16 +2369,23 @@
                 <w:sz w:val="20"/>
                 <w:szCs w:val="20"/>
               </w:rPr>
-              <w:t xml:space="preserve">⑦ 최종 </w:t>
-            </w:r>
-            <w:r>
-              <w:rPr>
-                <w:rFonts w:ascii="맑은 고딕" w:eastAsia="맑은 고딕" w:hAnsi="맑은 고딕" w:hint="eastAsia"/>
-                <w:sz w:val="20"/>
-                <w:szCs w:val="20"/>
-                <w:highlight w:val="yellow"/>
-              </w:rPr>
-              <w:t xml:space="preserve">[커밋·결과]</w:t>
+              <w:t xml:space="preserve">⑦ 최종 (</w:t>
+            </w:r>
+            <w:r>
+              <w:rPr>
+                <w:rFonts w:ascii="맑은 고딕" w:eastAsia="맑은 고딕" w:hAnsi="맑은 고딕" w:hint="eastAsia"/>
+                <w:sz w:val="20"/>
+                <w:szCs w:val="20"/>
+              </w:rPr>
+              <w:t xml:space="preserve">6ed5706</w:t>
+            </w:r>
+            <w:r>
+              <w:rPr>
+                <w:rFonts w:ascii="맑은 고딕" w:eastAsia="맑은 고딕" w:hAnsi="맑은 고딕" w:hint="eastAsia"/>
+                <w:sz w:val="20"/>
+                <w:szCs w:val="20"/>
+              </w:rPr>
+              <w:t xml:space="preserve">)</w:t>
             </w:r>
           </w:p>
         </w:tc>
@@ -2463,19 +2488,38 @@
             <w:r>
               <w:rPr>
                 <w:rFonts w:ascii="맑은 고딕" w:eastAsia="맑은 고딕" w:hAnsi="맑은 고딕" w:hint="eastAsia"/>
-                <w:sz w:val="20"/>
-                <w:szCs w:val="20"/>
-              </w:rPr>
-              <w:t xml:space="preserve">포위 탈출: 열세가 가장 작은 이웃으로 </w:t>
-            </w:r>
-            <w:r>
-              <w:rPr>
-                <w:rFonts w:ascii="맑은 고딕" w:eastAsia="맑은 고딕" w:hAnsi="맑은 고딕" w:hint="eastAsia"/>
-                <w:sz w:val="20"/>
-                <w:szCs w:val="20"/>
-                <w:highlight w:val="yellow"/>
-              </w:rPr>
-              <w:t xml:space="preserve">[+ ES 5차]</w:t>
+                <w:b/>
+                <w:bCs/>
+                <w:sz w:val="20"/>
+                <w:szCs w:val="20"/>
+              </w:rPr>
+              <w:t xml:space="preserve">포위 탈출</w:t>
+            </w:r>
+            <w:r>
+              <w:rPr>
+                <w:rFonts w:ascii="맑은 고딕" w:eastAsia="맑은 고딕" w:hAnsi="맑은 고딕" w:hint="eastAsia"/>
+                <w:sz w:val="20"/>
+                <w:szCs w:val="20"/>
+              </w:rPr>
+              <w:t xml:space="preserve">(문원), </w:t>
+            </w:r>
+            <w:r>
+              <w:rPr>
+                <w:rFonts w:ascii="맑은 고딕" w:eastAsia="맑은 고딕" w:hAnsi="맑은 고딕" w:hint="eastAsia"/>
+                <w:b/>
+                <w:bCs/>
+                <w:sz w:val="20"/>
+                <w:szCs w:val="20"/>
+              </w:rPr>
+              <w:t xml:space="preserve">막판 광장</w:t>
+            </w:r>
+            <w:r>
+              <w:rPr>
+                <w:rFonts w:ascii="맑은 고딕" w:eastAsia="맑은 고딕" w:hAnsi="맑은 고딕" w:hint="eastAsia"/>
+                <w:sz w:val="20"/>
+                <w:szCs w:val="20"/>
+              </w:rPr>
+              <w:t xml:space="preserve">·양동 150턴(성혁)</w:t>
             </w:r>
           </w:p>
         </w:tc>
@@ -2519,7 +2563,7 @@
                 <w:sz w:val="20"/>
                 <w:szCs w:val="20"/>
               </w:rPr>
-              <w:t xml:space="preserve">직전 제출본 상대 새 시드 1,600판 64.4~68.6%, 상대 7개 모두 상승</w:t>
+              <w:t xml:space="preserve">포위 탈출: 직전 제출본 상대 64.4~68.6%(새 시드 1,600판, 상대 7개 모두 +). 막판 광장 +2.5·+8.3%p</w:t>
             </w:r>
           </w:p>
         </w:tc>
@@ -2564,7 +2608,7 @@
                 <w:szCs w:val="20"/>
                 <w:highlight w:val="yellow"/>
               </w:rPr>
-              <w:t xml:space="preserve">[ ]</w:t>
+              <w:t xml:space="preserve">[최종 순위]</w:t>
             </w:r>
           </w:p>
         </w:tc>
@@ -3492,7 +3536,7 @@
           <w:sz w:val="20"/>
           <w:szCs w:val="20"/>
         </w:rPr>
-        <w:t xml:space="preserve"> 깃발병의 역 순간이동, 막판 특수 규칙, 전선 상시 배치, 한 턴 앞 예측, 요격, 역 차단 등 40여 가지는 같은 방식으로 시험해 뺐다. 1절의 원칙을 규칙 세부로 구현한 수정과 학습은 통했고 병력 배치를 다듬는 수정은 대부분 실패해, 배치는 학습 층에 맡기고 사람은 원칙을 판단 조건으로 옮기는 데 집중한 것이 최종 구조가 되었다.</w:t>
+        <w:t xml:space="preserve"> 깃발병의 역 순간이동, 막판 특수 규칙, 전선 상시 배치, 한 턴 앞 예측, 요격, 역 차단, 학습된 가중치를 이어 한 ES(5·6차) 등 40여 가지는 같은 방식으로 시험해 뺐다. 1절의 원칙을 규칙 세부로 구현한 수정과 학습은 통했고 병력 배치를 다듬는 수정은 대부분 실패해, 배치는 학습 층에 맡기고 사람은 원칙을 판단 조건으로 옮기는 데 집중한 것이 최종 구조가 되었다.</w:t>
       </w:r>
     </w:p>
     <w:p>
@@ -4788,7 +4832,7 @@
                 <w:sz w:val="18"/>
                 <w:szCs w:val="18"/>
               </w:rPr>
-              <w:t xml:space="preserve">같음</w:t>
+              <w:t xml:space="preserve">같음 (문원·성혁·현진)</w:t>
             </w:r>
           </w:p>
         </w:tc>
@@ -4807,7 +4851,7 @@
                 <w:sz w:val="18"/>
                 <w:szCs w:val="18"/>
               </w:rPr>
-              <w:t xml:space="preserve">진 경기 분석, 포위 탈출, ES 5차</w:t>
+              <w:t xml:space="preserve">진 경기 턴별 분석, 포위 탈출, 리더보드 48판 승패 분석(성혁), ES 5·6차, 세 브랜치 최종 병합 비교</w:t>
             </w:r>
           </w:p>
         </w:tc>
@@ -4826,7 +4870,7 @@
                 <w:sz w:val="18"/>
                 <w:szCs w:val="18"/>
               </w:rPr>
-              <w:t xml:space="preserve">포위 탈출과 변형, 역 차단 등</w:t>
+              <w:t xml:space="preserve">포위 탈출과 변형, 역 차단·탈환 확대 등, 막판 광장·막판 저격(성혁)</w:t>
             </w:r>
           </w:p>
         </w:tc>
@@ -4845,7 +4889,7 @@
                 <w:sz w:val="18"/>
                 <w:szCs w:val="18"/>
               </w:rPr>
-              <w:t xml:space="preserve">새 시드 세 묶음, 상대 7개</w:t>
+              <w:t xml:space="preserve">새 시드 세 묶음·상대 7개, 병합 후보 8개 × 400판, 마감 직전 600~1,000판</w:t>
             </w:r>
           </w:p>
         </w:tc>
@@ -4863,9 +4907,24 @@
                 <w:rFonts w:ascii="맑은 고딕" w:eastAsia="맑은 고딕" w:hAnsi="맑은 고딕" w:hint="eastAsia"/>
                 <w:sz w:val="18"/>
                 <w:szCs w:val="18"/>
-                <w:highlight w:val="yellow"/>
-              </w:rPr>
-              <w:t xml:space="preserve">[ ]</w:t>
+              </w:rPr>
+              <w:t xml:space="preserve">포위 탈출 + 막판 광장 + 양동 150턴 (</w:t>
+            </w:r>
+            <w:r>
+              <w:rPr>
+                <w:rFonts w:ascii="맑은 고딕" w:eastAsia="맑은 고딕" w:hAnsi="맑은 고딕" w:hint="eastAsia"/>
+                <w:sz w:val="18"/>
+                <w:szCs w:val="18"/>
+              </w:rPr>
+              <w:t xml:space="preserve">6ed5706</w:t>
+            </w:r>
+            <w:r>
+              <w:rPr>
+                <w:rFonts w:ascii="맑은 고딕" w:eastAsia="맑은 고딕" w:hAnsi="맑은 고딕" w:hint="eastAsia"/>
+                <w:sz w:val="18"/>
+                <w:szCs w:val="18"/>
+              </w:rPr>
+              <w:t xml:space="preserve">, 학습 가중치는 ES 4차 그대로)</w:t>
             </w:r>
           </w:p>
         </w:tc>
@@ -5033,6 +5092,34 @@
           <w:szCs w:val="18"/>
         </w:rPr>
         <w:t xml:space="preserve">· ⑦ 현진: "추격하는것을 따돌리는 걸 좀 더 생각해봐"</w:t>
+      </w:r>
+    </w:p>
+    <w:p>
+      <w:pPr>
+        <w:spacing w:after="40" w:line="240" w:lineRule="auto"/>
+        <w:ind w:left="200" w:hanging="200"/>
+      </w:pPr>
+      <w:r>
+        <w:rPr>
+          <w:rFonts w:ascii="맑은 고딕" w:eastAsia="맑은 고딕" w:hAnsi="맑은 고딕" w:hint="eastAsia"/>
+          <w:sz w:val="18"/>
+          <w:szCs w:val="18"/>
+        </w:rPr>
+        <w:t xml:space="preserve">· ⑦ 성혁: "지금 현재 5시 리더보드 결과가 merge 되어있는지 확인해주고 지금까지 가장 최근 50판 리더보드 승패 요인을 제대로 분석하고 남은 5시간 동안 업데이트와 개선을 진행할 수 있는 방면과 …"</w:t>
+      </w:r>
+    </w:p>
+    <w:p>
+      <w:pPr>
+        <w:spacing w:after="40" w:line="240" w:lineRule="auto"/>
+        <w:ind w:left="200" w:hanging="200"/>
+      </w:pPr>
+      <w:r>
+        <w:rPr>
+          <w:rFonts w:ascii="맑은 고딕" w:eastAsia="맑은 고딕" w:hAnsi="맑은 고딕" w:hint="eastAsia"/>
+          <w:sz w:val="18"/>
+          <w:szCs w:val="18"/>
+        </w:rPr>
+        <w:t xml:space="preserve">· ⑦ 문원: "40분 쯤에 성혁이 진행한 개선이랑 현진이 진행한 개선 올라올 테니까 병합해보고 진짜 짧게 10분만 테스트해보고 제출본 결정하자"</w:t>
       </w:r>
     </w:p>
     <w:p>

</xml_diff>